<commit_message>
Ultimate React Course: update section 17
</commit_message>
<xml_diff>
--- a/3.React/UltimateReactCourse/Document/0.docx
+++ b/3.React/UltimateReactCourse/Document/0.docx
@@ -1,6 +1,6 @@
 
 <file path=word/document.xml><?xml version="1.0" encoding="utf-8"?>
-<w:document xmlns:wpc="http://schemas.microsoft.com/office/word/2010/wordprocessingCanvas" xmlns:cx="http://schemas.microsoft.com/office/drawing/2014/chartex" xmlns:mc="http://schemas.openxmlformats.org/markup-compatibility/2006" xmlns:o="urn:schemas-microsoft-com:office:office" xmlns:r="http://schemas.openxmlformats.org/officeDocument/2006/relationships" xmlns:m="http://schemas.openxmlformats.org/officeDocument/2006/math" xmlns:v="urn:schemas-microsoft-com:vml" xmlns:wp14="http://schemas.microsoft.com/office/word/2010/wordprocessingDrawing" xmlns:wp="http://schemas.openxmlformats.org/drawingml/2006/wordprocessingDrawing" xmlns:w10="urn:schemas-microsoft-com:office:word" xmlns:w="http://schemas.openxmlformats.org/wordprocessingml/2006/main" xmlns:w14="http://schemas.microsoft.com/office/word/2010/wordml" xmlns:w15="http://schemas.microsoft.com/office/word/2012/wordml" xmlns:w16se="http://schemas.microsoft.com/office/word/2015/wordml/symex" xmlns:wpg="http://schemas.microsoft.com/office/word/2010/wordprocessingGroup" xmlns:wpi="http://schemas.microsoft.com/office/word/2010/wordprocessingInk" xmlns:wne="http://schemas.microsoft.com/office/word/2006/wordml" xmlns:wps="http://schemas.microsoft.com/office/word/2010/wordprocessingShape" mc:Ignorable="w14 w15 w16se wp14">
+<w:document xmlns:wpc="http://schemas.microsoft.com/office/word/2010/wordprocessingCanvas" xmlns:cx="http://schemas.microsoft.com/office/drawing/2014/chartex" xmlns:cx1="http://schemas.microsoft.com/office/drawing/2015/9/8/chartex" xmlns:cx2="http://schemas.microsoft.com/office/drawing/2015/10/21/chartex" xmlns:cx3="http://schemas.microsoft.com/office/drawing/2016/5/9/chartex" xmlns:cx4="http://schemas.microsoft.com/office/drawing/2016/5/10/chartex" xmlns:cx5="http://schemas.microsoft.com/office/drawing/2016/5/11/chartex" xmlns:cx6="http://schemas.microsoft.com/office/drawing/2016/5/12/chartex" xmlns:cx7="http://schemas.microsoft.com/office/drawing/2016/5/13/chartex" xmlns:cx8="http://schemas.microsoft.com/office/drawing/2016/5/14/chartex" xmlns:mc="http://schemas.openxmlformats.org/markup-compatibility/2006" xmlns:aink="http://schemas.microsoft.com/office/drawing/2016/ink" xmlns:am3d="http://schemas.microsoft.com/office/drawing/2017/model3d" xmlns:o="urn:schemas-microsoft-com:office:office" xmlns:oel="http://schemas.microsoft.com/office/2019/extlst" xmlns:r="http://schemas.openxmlformats.org/officeDocument/2006/relationships" xmlns:m="http://schemas.openxmlformats.org/officeDocument/2006/math" xmlns:v="urn:schemas-microsoft-com:vml" xmlns:wp14="http://schemas.microsoft.com/office/word/2010/wordprocessingDrawing" xmlns:wp="http://schemas.openxmlformats.org/drawingml/2006/wordprocessingDrawing" xmlns:w10="urn:schemas-microsoft-com:office:word" xmlns:w="http://schemas.openxmlformats.org/wordprocessingml/2006/main" xmlns:w14="http://schemas.microsoft.com/office/word/2010/wordml" xmlns:w15="http://schemas.microsoft.com/office/word/2012/wordml" xmlns:w16cex="http://schemas.microsoft.com/office/word/2018/wordml/cex" xmlns:w16cid="http://schemas.microsoft.com/office/word/2016/wordml/cid" xmlns:w16="http://schemas.microsoft.com/office/word/2018/wordml" xmlns:w16du="http://schemas.microsoft.com/office/word/2023/wordml/word16du" xmlns:w16sdtdh="http://schemas.microsoft.com/office/word/2020/wordml/sdtdatahash" xmlns:w16sdtfl="http://schemas.microsoft.com/office/word/2024/wordml/sdtformatlock" xmlns:w16se="http://schemas.microsoft.com/office/word/2015/wordml/symex" xmlns:wpg="http://schemas.microsoft.com/office/word/2010/wordprocessingGroup" xmlns:wpi="http://schemas.microsoft.com/office/word/2010/wordprocessingInk" xmlns:wne="http://schemas.microsoft.com/office/word/2006/wordml" xmlns:wps="http://schemas.microsoft.com/office/word/2010/wordprocessingShape" mc:Ignorable="w14 w15 w16se w16cid w16 w16cex w16sdtdh w16sdtfl w16du wp14">
   <w:body>
     <w:p>
       <w:pPr>
@@ -394,30 +394,36 @@
         </w:rPr>
         <w:t xml:space="preserve"> start</w:t>
       </w:r>
-      <w:bookmarkStart w:id="0" w:name="_GoBack"/>
-      <w:bookmarkEnd w:id="0"/>
-    </w:p>
-    <w:p>
-      <w:pPr>
-        <w:rPr>
-          <w:sz w:val="40"/>
-          <w:szCs w:val="40"/>
-        </w:rPr>
-      </w:pPr>
-      <w:r>
-        <w:rPr>
-          <w:sz w:val="40"/>
-          <w:szCs w:val="40"/>
-        </w:rPr>
-        <w:t xml:space="preserve">-Set up project with </w:t>
-      </w:r>
+    </w:p>
+    <w:p>
+      <w:pPr>
+        <w:rPr>
+          <w:sz w:val="40"/>
+          <w:szCs w:val="40"/>
+        </w:rPr>
+      </w:pPr>
+      <w:r>
+        <w:rPr>
+          <w:sz w:val="40"/>
+          <w:szCs w:val="40"/>
+        </w:rPr>
+        <w:t>-Set up project with Vite:</w:t>
+      </w:r>
+    </w:p>
+    <w:p>
+      <w:pPr>
+        <w:rPr>
+          <w:sz w:val="40"/>
+          <w:szCs w:val="40"/>
+        </w:rPr>
+      </w:pPr>
       <w:proofErr w:type="spellStart"/>
       <w:r>
         <w:rPr>
           <w:sz w:val="40"/>
           <w:szCs w:val="40"/>
         </w:rPr>
-        <w:t>Vite</w:t>
+        <w:t>npm</w:t>
       </w:r>
       <w:proofErr w:type="spellEnd"/>
       <w:r>
@@ -425,22 +431,38 @@
           <w:sz w:val="40"/>
           <w:szCs w:val="40"/>
         </w:rPr>
-        <w:t>:</w:t>
-      </w:r>
-    </w:p>
-    <w:p>
-      <w:pPr>
-        <w:rPr>
-          <w:sz w:val="40"/>
-          <w:szCs w:val="40"/>
-        </w:rPr>
-      </w:pPr>
+        <w:t xml:space="preserve"> create </w:t>
+      </w:r>
       <w:proofErr w:type="spellStart"/>
       <w:r>
         <w:rPr>
           <w:sz w:val="40"/>
           <w:szCs w:val="40"/>
         </w:rPr>
+        <w:t>vite@latest</w:t>
+      </w:r>
+      <w:proofErr w:type="spellEnd"/>
+      <w:r>
+        <w:rPr>
+          <w:sz w:val="40"/>
+          <w:szCs w:val="40"/>
+        </w:rPr>
+        <w:t xml:space="preserve"> &lt;folder-name&gt; -- --template react </w:t>
+      </w:r>
+    </w:p>
+    <w:p>
+      <w:pPr>
+        <w:rPr>
+          <w:sz w:val="40"/>
+          <w:szCs w:val="40"/>
+        </w:rPr>
+      </w:pPr>
+      <w:proofErr w:type="spellStart"/>
+      <w:r>
+        <w:rPr>
+          <w:sz w:val="40"/>
+          <w:szCs w:val="40"/>
+        </w:rPr>
         <w:t>npm</w:t>
       </w:r>
       <w:proofErr w:type="spellEnd"/>
@@ -449,15 +471,23 @@
           <w:sz w:val="40"/>
           <w:szCs w:val="40"/>
         </w:rPr>
-        <w:t xml:space="preserve"> create </w:t>
-      </w:r>
+        <w:t xml:space="preserve"> install</w:t>
+      </w:r>
+    </w:p>
+    <w:p>
+      <w:pPr>
+        <w:rPr>
+          <w:sz w:val="40"/>
+          <w:szCs w:val="40"/>
+        </w:rPr>
+      </w:pPr>
       <w:proofErr w:type="spellStart"/>
       <w:r>
         <w:rPr>
           <w:sz w:val="40"/>
           <w:szCs w:val="40"/>
         </w:rPr>
-        <w:t>vite@latest</w:t>
+        <w:t>npm</w:t>
       </w:r>
       <w:proofErr w:type="spellEnd"/>
       <w:r>
@@ -465,22 +495,212 @@
           <w:sz w:val="40"/>
           <w:szCs w:val="40"/>
         </w:rPr>
-        <w:t xml:space="preserve"> &lt;folder-name&gt; -- --template react </w:t>
-      </w:r>
-    </w:p>
-    <w:p>
-      <w:pPr>
-        <w:rPr>
-          <w:sz w:val="40"/>
-          <w:szCs w:val="40"/>
-        </w:rPr>
-      </w:pPr>
+        <w:t xml:space="preserve"> run dev</w:t>
+      </w:r>
+    </w:p>
+    <w:p>
+      <w:pPr>
+        <w:rPr>
+          <w:sz w:val="40"/>
+          <w:szCs w:val="40"/>
+        </w:rPr>
+      </w:pPr>
+      <w:r>
+        <w:rPr>
+          <w:sz w:val="40"/>
+          <w:szCs w:val="40"/>
+        </w:rPr>
+        <w:t>-Vite:</w:t>
+      </w:r>
+    </w:p>
+    <w:p>
+      <w:pPr>
+        <w:rPr>
+          <w:sz w:val="40"/>
+          <w:szCs w:val="40"/>
+        </w:rPr>
+      </w:pPr>
+      <w:r>
+        <w:rPr>
+          <w:sz w:val="40"/>
+          <w:szCs w:val="40"/>
+        </w:rPr>
+        <w:t>+</w:t>
+      </w:r>
       <w:proofErr w:type="spellStart"/>
       <w:r>
         <w:rPr>
           <w:sz w:val="40"/>
           <w:szCs w:val="40"/>
         </w:rPr>
+        <w:t>ESlint</w:t>
+      </w:r>
+      <w:proofErr w:type="spellEnd"/>
+      <w:r>
+        <w:rPr>
+          <w:sz w:val="40"/>
+          <w:szCs w:val="40"/>
+        </w:rPr>
+        <w:t xml:space="preserve">: </w:t>
+      </w:r>
+    </w:p>
+    <w:p>
+      <w:pPr>
+        <w:rPr>
+          <w:sz w:val="40"/>
+          <w:szCs w:val="40"/>
+        </w:rPr>
+      </w:pPr>
+      <w:proofErr w:type="gramStart"/>
+      <w:r>
+        <w:rPr>
+          <w:sz w:val="40"/>
+          <w:szCs w:val="40"/>
+        </w:rPr>
+        <w:t>Create .</w:t>
+      </w:r>
+      <w:proofErr w:type="spellStart"/>
+      <w:r>
+        <w:rPr>
+          <w:sz w:val="40"/>
+          <w:szCs w:val="40"/>
+        </w:rPr>
+        <w:t>eslintrc</w:t>
+      </w:r>
+      <w:proofErr w:type="gramEnd"/>
+      <w:r>
+        <w:rPr>
+          <w:sz w:val="40"/>
+          <w:szCs w:val="40"/>
+        </w:rPr>
+        <w:t>.json</w:t>
+      </w:r>
+      <w:proofErr w:type="spellEnd"/>
+    </w:p>
+    <w:p>
+      <w:pPr>
+        <w:rPr>
+          <w:sz w:val="40"/>
+          <w:szCs w:val="40"/>
+        </w:rPr>
+      </w:pPr>
+      <w:r>
+        <w:rPr>
+          <w:noProof/>
+        </w:rPr>
+        <w:drawing>
+          <wp:inline distT="0" distB="0" distL="0" distR="0" wp14:anchorId="7D6D79B5" wp14:editId="766A74EE">
+            <wp:extent cx="1847850" cy="533400"/>
+            <wp:effectExtent l="0" t="0" r="0" b="0"/>
+            <wp:docPr id="1197440768" name="Picture 1" descr="A black background with white text&#10;&#10;AI-generated content may be incorrect."/>
+            <wp:cNvGraphicFramePr>
+              <a:graphicFrameLocks xmlns:a="http://schemas.openxmlformats.org/drawingml/2006/main" noChangeAspect="1"/>
+            </wp:cNvGraphicFramePr>
+            <a:graphic xmlns:a="http://schemas.openxmlformats.org/drawingml/2006/main">
+              <a:graphicData uri="http://schemas.openxmlformats.org/drawingml/2006/picture">
+                <pic:pic xmlns:pic="http://schemas.openxmlformats.org/drawingml/2006/picture">
+                  <pic:nvPicPr>
+                    <pic:cNvPr id="1197440768" name="Picture 1" descr="A black background with white text&#10;&#10;AI-generated content may be incorrect."/>
+                    <pic:cNvPicPr/>
+                  </pic:nvPicPr>
+                  <pic:blipFill>
+                    <a:blip r:embed="rId9"/>
+                    <a:stretch>
+                      <a:fillRect/>
+                    </a:stretch>
+                  </pic:blipFill>
+                  <pic:spPr>
+                    <a:xfrm>
+                      <a:off x="0" y="0"/>
+                      <a:ext cx="1847850" cy="533400"/>
+                    </a:xfrm>
+                    <a:prstGeom prst="rect">
+                      <a:avLst/>
+                    </a:prstGeom>
+                  </pic:spPr>
+                </pic:pic>
+              </a:graphicData>
+            </a:graphic>
+          </wp:inline>
+        </w:drawing>
+      </w:r>
+    </w:p>
+    <w:p>
+      <w:pPr>
+        <w:rPr>
+          <w:sz w:val="40"/>
+          <w:szCs w:val="40"/>
+        </w:rPr>
+      </w:pPr>
+      <w:r>
+        <w:rPr>
+          <w:sz w:val="40"/>
+          <w:szCs w:val="40"/>
+        </w:rPr>
+        <w:t>In vite.config.js:</w:t>
+      </w:r>
+    </w:p>
+    <w:p>
+      <w:pPr>
+        <w:rPr>
+          <w:sz w:val="40"/>
+          <w:szCs w:val="40"/>
+        </w:rPr>
+      </w:pPr>
+      <w:r>
+        <w:rPr>
+          <w:noProof/>
+        </w:rPr>
+        <w:drawing>
+          <wp:inline distT="0" distB="0" distL="0" distR="0" wp14:anchorId="0408A418" wp14:editId="5A4641AA">
+            <wp:extent cx="3038475" cy="866775"/>
+            <wp:effectExtent l="0" t="0" r="9525" b="9525"/>
+            <wp:docPr id="1431270496" name="Picture 1" descr="A screen shot of a computer code&#10;&#10;AI-generated content may be incorrect."/>
+            <wp:cNvGraphicFramePr>
+              <a:graphicFrameLocks xmlns:a="http://schemas.openxmlformats.org/drawingml/2006/main" noChangeAspect="1"/>
+            </wp:cNvGraphicFramePr>
+            <a:graphic xmlns:a="http://schemas.openxmlformats.org/drawingml/2006/main">
+              <a:graphicData uri="http://schemas.openxmlformats.org/drawingml/2006/picture">
+                <pic:pic xmlns:pic="http://schemas.openxmlformats.org/drawingml/2006/picture">
+                  <pic:nvPicPr>
+                    <pic:cNvPr id="1431270496" name="Picture 1" descr="A screen shot of a computer code&#10;&#10;AI-generated content may be incorrect."/>
+                    <pic:cNvPicPr/>
+                  </pic:nvPicPr>
+                  <pic:blipFill>
+                    <a:blip r:embed="rId10"/>
+                    <a:stretch>
+                      <a:fillRect/>
+                    </a:stretch>
+                  </pic:blipFill>
+                  <pic:spPr>
+                    <a:xfrm>
+                      <a:off x="0" y="0"/>
+                      <a:ext cx="3038475" cy="866775"/>
+                    </a:xfrm>
+                    <a:prstGeom prst="rect">
+                      <a:avLst/>
+                    </a:prstGeom>
+                  </pic:spPr>
+                </pic:pic>
+              </a:graphicData>
+            </a:graphic>
+          </wp:inline>
+        </w:drawing>
+      </w:r>
+    </w:p>
+    <w:p>
+      <w:pPr>
+        <w:rPr>
+          <w:sz w:val="40"/>
+          <w:szCs w:val="40"/>
+        </w:rPr>
+      </w:pPr>
+      <w:proofErr w:type="spellStart"/>
+      <w:r>
+        <w:rPr>
+          <w:sz w:val="40"/>
+          <w:szCs w:val="40"/>
+        </w:rPr>
         <w:t>npm</w:t>
       </w:r>
       <w:proofErr w:type="spellEnd"/>
@@ -489,23 +709,15 @@
           <w:sz w:val="40"/>
           <w:szCs w:val="40"/>
         </w:rPr>
-        <w:t xml:space="preserve"> install</w:t>
-      </w:r>
-    </w:p>
-    <w:p>
-      <w:pPr>
-        <w:rPr>
-          <w:sz w:val="40"/>
-          <w:szCs w:val="40"/>
-        </w:rPr>
-      </w:pPr>
+        <w:t xml:space="preserve"> install eslint@8 </w:t>
+      </w:r>
       <w:proofErr w:type="spellStart"/>
       <w:r>
         <w:rPr>
           <w:sz w:val="40"/>
           <w:szCs w:val="40"/>
         </w:rPr>
-        <w:t>npm</w:t>
+        <w:t>vite</w:t>
       </w:r>
       <w:proofErr w:type="spellEnd"/>
       <w:r>
@@ -513,7 +725,39 @@
           <w:sz w:val="40"/>
           <w:szCs w:val="40"/>
         </w:rPr>
-        <w:t xml:space="preserve"> run dev</w:t>
+        <w:t>-plugin-</w:t>
+      </w:r>
+      <w:proofErr w:type="spellStart"/>
+      <w:r>
+        <w:rPr>
+          <w:sz w:val="40"/>
+          <w:szCs w:val="40"/>
+        </w:rPr>
+        <w:t>eslint</w:t>
+      </w:r>
+      <w:proofErr w:type="spellEnd"/>
+      <w:r>
+        <w:rPr>
+          <w:sz w:val="40"/>
+          <w:szCs w:val="40"/>
+        </w:rPr>
+        <w:t xml:space="preserve"> </w:t>
+      </w:r>
+      <w:proofErr w:type="spellStart"/>
+      <w:r>
+        <w:rPr>
+          <w:sz w:val="40"/>
+          <w:szCs w:val="40"/>
+        </w:rPr>
+        <w:t>eslint</w:t>
+      </w:r>
+      <w:proofErr w:type="spellEnd"/>
+      <w:r>
+        <w:rPr>
+          <w:sz w:val="40"/>
+          <w:szCs w:val="40"/>
+        </w:rPr>
+        <w:t>-config-react-app --save-dev</w:t>
       </w:r>
     </w:p>
     <w:sectPr>
@@ -527,7 +771,7 @@
 </file>
 
 <file path=word/styles.xml><?xml version="1.0" encoding="utf-8"?>
-<w:styles xmlns:mc="http://schemas.openxmlformats.org/markup-compatibility/2006" xmlns:r="http://schemas.openxmlformats.org/officeDocument/2006/relationships" xmlns:w="http://schemas.openxmlformats.org/wordprocessingml/2006/main" xmlns:w14="http://schemas.microsoft.com/office/word/2010/wordml" xmlns:w15="http://schemas.microsoft.com/office/word/2012/wordml" xmlns:w16se="http://schemas.microsoft.com/office/word/2015/wordml/symex" mc:Ignorable="w14 w15 w16se">
+<w:styles xmlns:mc="http://schemas.openxmlformats.org/markup-compatibility/2006" xmlns:r="http://schemas.openxmlformats.org/officeDocument/2006/relationships" xmlns:w="http://schemas.openxmlformats.org/wordprocessingml/2006/main" xmlns:w14="http://schemas.microsoft.com/office/word/2010/wordml" xmlns:w15="http://schemas.microsoft.com/office/word/2012/wordml" xmlns:w16cex="http://schemas.microsoft.com/office/word/2018/wordml/cex" xmlns:w16cid="http://schemas.microsoft.com/office/word/2016/wordml/cid" xmlns:w16="http://schemas.microsoft.com/office/word/2018/wordml" xmlns:w16du="http://schemas.microsoft.com/office/word/2023/wordml/word16du" xmlns:w16sdtdh="http://schemas.microsoft.com/office/word/2020/wordml/sdtdatahash" xmlns:w16sdtfl="http://schemas.microsoft.com/office/word/2024/wordml/sdtformatlock" xmlns:w16se="http://schemas.microsoft.com/office/word/2015/wordml/symex" mc:Ignorable="w14 w15 w16se w16cid w16 w16cex w16sdtdh w16sdtfl w16du">
   <w:docDefaults>
     <w:rPrDefault>
       <w:rPr>
@@ -545,7 +789,7 @@
       </w:pPr>
     </w:pPrDefault>
   </w:docDefaults>
-  <w:latentStyles w:defLockedState="0" w:defUIPriority="99" w:defSemiHidden="0" w:defUnhideWhenUsed="0" w:defQFormat="0" w:count="371">
+  <w:latentStyles w:defLockedState="0" w:defUIPriority="99" w:defSemiHidden="0" w:defUnhideWhenUsed="0" w:defQFormat="0" w:count="376">
     <w:lsdException w:name="Normal" w:uiPriority="0" w:qFormat="1"/>
     <w:lsdException w:name="heading 1" w:uiPriority="9" w:qFormat="1"/>
     <w:lsdException w:name="heading 2" w:semiHidden="1" w:uiPriority="9" w:unhideWhenUsed="1" w:qFormat="1"/>
@@ -917,6 +1161,11 @@
     <w:lsdException w:name="List Table 5 Dark Accent 6" w:uiPriority="50"/>
     <w:lsdException w:name="List Table 6 Colorful Accent 6" w:uiPriority="51"/>
     <w:lsdException w:name="List Table 7 Colorful Accent 6" w:uiPriority="52"/>
+    <w:lsdException w:name="Mention" w:semiHidden="1" w:unhideWhenUsed="1"/>
+    <w:lsdException w:name="Smart Hyperlink" w:semiHidden="1" w:unhideWhenUsed="1"/>
+    <w:lsdException w:name="Hashtag" w:semiHidden="1" w:unhideWhenUsed="1"/>
+    <w:lsdException w:name="Unresolved Mention" w:semiHidden="1" w:unhideWhenUsed="1"/>
+    <w:lsdException w:name="Smart Link" w:semiHidden="1" w:unhideWhenUsed="1"/>
   </w:latentStyles>
   <w:style w:type="paragraph" w:default="1" w:styleId="Normal">
     <w:name w:val="Normal"/>
@@ -1449,8 +1698,8 @@
       <w:u w:val="single"/>
     </w:rPr>
   </w:style>
-  <w:style w:type="character" w:customStyle="1" w:styleId="UnresolvedMention">
-    <w:name w:val="Unresolved Mention"/>
+  <w:style w:type="character" w:customStyle="1" w:styleId="UnresolvedMention1">
+    <w:name w:val="Unresolved Mention1"/>
     <w:basedOn w:val="DefaultParagraphFont"/>
     <w:uiPriority w:val="99"/>
     <w:semiHidden/>

</xml_diff>

<commit_message>
Ultimate React Course: complete section 20
</commit_message>
<xml_diff>
--- a/3.React/UltimateReactCourse/Document/0.docx
+++ b/3.React/UltimateReactCourse/Document/0.docx
@@ -14,7 +14,23 @@
           <w:sz w:val="40"/>
           <w:szCs w:val="40"/>
         </w:rPr>
-        <w:t xml:space="preserve">-Github: </w:t>
+        <w:t>-</w:t>
+      </w:r>
+      <w:proofErr w:type="spellStart"/>
+      <w:r>
+        <w:rPr>
+          <w:sz w:val="40"/>
+          <w:szCs w:val="40"/>
+        </w:rPr>
+        <w:t>Github</w:t>
+      </w:r>
+      <w:proofErr w:type="spellEnd"/>
+      <w:r>
+        <w:rPr>
+          <w:sz w:val="40"/>
+          <w:szCs w:val="40"/>
+        </w:rPr>
+        <w:t xml:space="preserve">: </w:t>
       </w:r>
       <w:hyperlink r:id="rId4" w:history="1">
         <w:r>
@@ -186,52 +202,116 @@
           <w:sz w:val="40"/>
           <w:szCs w:val="40"/>
         </w:rPr>
-        <w:t>+ESLint: automatically find errors</w:t>
-      </w:r>
-    </w:p>
-    <w:p>
-      <w:pPr>
-        <w:rPr>
-          <w:sz w:val="40"/>
-          <w:szCs w:val="40"/>
-        </w:rPr>
-      </w:pPr>
-      <w:r>
-        <w:rPr>
-          <w:sz w:val="40"/>
-          <w:szCs w:val="40"/>
-        </w:rPr>
-        <w:t>+Prettier-Code formatter: automatically format code</w:t>
-      </w:r>
-    </w:p>
-    <w:p>
-      <w:pPr>
-        <w:rPr>
-          <w:sz w:val="40"/>
-          <w:szCs w:val="40"/>
-        </w:rPr>
-      </w:pPr>
-      <w:r>
-        <w:rPr>
-          <w:sz w:val="40"/>
-          <w:szCs w:val="40"/>
-        </w:rPr>
-        <w:t>+One Monokai Theme: Set color theme</w:t>
-      </w:r>
-    </w:p>
-    <w:p>
-      <w:pPr>
-        <w:rPr>
-          <w:sz w:val="40"/>
-          <w:szCs w:val="40"/>
-        </w:rPr>
-      </w:pPr>
-      <w:r>
-        <w:rPr>
-          <w:sz w:val="40"/>
-          <w:szCs w:val="40"/>
-        </w:rPr>
-        <w:t>+Material Icon Theme:  theme for file icons</w:t>
+        <w:t>+</w:t>
+      </w:r>
+      <w:proofErr w:type="spellStart"/>
+      <w:r>
+        <w:rPr>
+          <w:sz w:val="40"/>
+          <w:szCs w:val="40"/>
+        </w:rPr>
+        <w:t>ESLint</w:t>
+      </w:r>
+      <w:proofErr w:type="spellEnd"/>
+      <w:r>
+        <w:rPr>
+          <w:sz w:val="40"/>
+          <w:szCs w:val="40"/>
+        </w:rPr>
+        <w:t>: automatically find errors</w:t>
+      </w:r>
+    </w:p>
+    <w:p>
+      <w:pPr>
+        <w:rPr>
+          <w:sz w:val="40"/>
+          <w:szCs w:val="40"/>
+        </w:rPr>
+      </w:pPr>
+      <w:r>
+        <w:rPr>
+          <w:sz w:val="40"/>
+          <w:szCs w:val="40"/>
+        </w:rPr>
+        <w:t xml:space="preserve">+Prettier-Code </w:t>
+      </w:r>
+      <w:proofErr w:type="gramStart"/>
+      <w:r>
+        <w:rPr>
+          <w:sz w:val="40"/>
+          <w:szCs w:val="40"/>
+        </w:rPr>
+        <w:t>formatter</w:t>
+      </w:r>
+      <w:proofErr w:type="gramEnd"/>
+      <w:r>
+        <w:rPr>
+          <w:sz w:val="40"/>
+          <w:szCs w:val="40"/>
+        </w:rPr>
+        <w:t>: automatically format code</w:t>
+      </w:r>
+    </w:p>
+    <w:p>
+      <w:pPr>
+        <w:rPr>
+          <w:sz w:val="40"/>
+          <w:szCs w:val="40"/>
+        </w:rPr>
+      </w:pPr>
+      <w:r>
+        <w:rPr>
+          <w:sz w:val="40"/>
+          <w:szCs w:val="40"/>
+        </w:rPr>
+        <w:t xml:space="preserve">+One </w:t>
+      </w:r>
+      <w:proofErr w:type="spellStart"/>
+      <w:r>
+        <w:rPr>
+          <w:sz w:val="40"/>
+          <w:szCs w:val="40"/>
+        </w:rPr>
+        <w:t>Monokai</w:t>
+      </w:r>
+      <w:proofErr w:type="spellEnd"/>
+      <w:r>
+        <w:rPr>
+          <w:sz w:val="40"/>
+          <w:szCs w:val="40"/>
+        </w:rPr>
+        <w:t xml:space="preserve"> Theme: Set color theme</w:t>
+      </w:r>
+    </w:p>
+    <w:p>
+      <w:pPr>
+        <w:rPr>
+          <w:sz w:val="40"/>
+          <w:szCs w:val="40"/>
+        </w:rPr>
+      </w:pPr>
+      <w:r>
+        <w:rPr>
+          <w:sz w:val="40"/>
+          <w:szCs w:val="40"/>
+        </w:rPr>
+        <w:t>+Material Icon Theme</w:t>
+      </w:r>
+      <w:proofErr w:type="gramStart"/>
+      <w:r>
+        <w:rPr>
+          <w:sz w:val="40"/>
+          <w:szCs w:val="40"/>
+        </w:rPr>
+        <w:t>:  theme</w:t>
+      </w:r>
+      <w:proofErr w:type="gramEnd"/>
+      <w:r>
+        <w:rPr>
+          <w:sz w:val="40"/>
+          <w:szCs w:val="40"/>
+        </w:rPr>
+        <w:t xml:space="preserve"> for file icons</w:t>
       </w:r>
     </w:p>
     <w:p>
@@ -262,22 +342,55 @@
           <w:szCs w:val="40"/>
         </w:rPr>
         <w:lastRenderedPageBreak/>
-        <w:t>-Set up project with Create-React-App:</w:t>
-      </w:r>
-    </w:p>
-    <w:p>
-      <w:pPr>
-        <w:rPr>
-          <w:sz w:val="40"/>
-          <w:szCs w:val="40"/>
-        </w:rPr>
-      </w:pPr>
-      <w:r>
-        <w:rPr>
-          <w:sz w:val="40"/>
-          <w:szCs w:val="40"/>
-        </w:rPr>
-        <w:t>npx create-react-app@</w:t>
+        <w:t xml:space="preserve">-Set up </w:t>
+      </w:r>
+      <w:proofErr w:type="gramStart"/>
+      <w:r>
+        <w:rPr>
+          <w:sz w:val="40"/>
+          <w:szCs w:val="40"/>
+        </w:rPr>
+        <w:t>project</w:t>
+      </w:r>
+      <w:proofErr w:type="gramEnd"/>
+      <w:r>
+        <w:rPr>
+          <w:sz w:val="40"/>
+          <w:szCs w:val="40"/>
+        </w:rPr>
+        <w:t xml:space="preserve"> with Create-React-App:</w:t>
+      </w:r>
+    </w:p>
+    <w:p>
+      <w:pPr>
+        <w:rPr>
+          <w:sz w:val="40"/>
+          <w:szCs w:val="40"/>
+        </w:rPr>
+      </w:pPr>
+      <w:proofErr w:type="spellStart"/>
+      <w:r>
+        <w:rPr>
+          <w:sz w:val="40"/>
+          <w:szCs w:val="40"/>
+        </w:rPr>
+        <w:t>npx</w:t>
+      </w:r>
+      <w:proofErr w:type="spellEnd"/>
+      <w:r>
+        <w:rPr>
+          <w:sz w:val="40"/>
+          <w:szCs w:val="40"/>
+        </w:rPr>
+        <w:t xml:space="preserve"> </w:t>
+      </w:r>
+      <w:proofErr w:type="spellStart"/>
+      <w:r>
+        <w:rPr>
+          <w:sz w:val="40"/>
+          <w:szCs w:val="40"/>
+        </w:rPr>
+        <w:t>create-react-app@</w:t>
       </w:r>
       <w:r>
         <w:rPr>
@@ -288,6 +401,7 @@
         </w:rPr>
         <w:t>version</w:t>
       </w:r>
+      <w:proofErr w:type="spellEnd"/>
       <w:r>
         <w:rPr>
           <w:sz w:val="40"/>
@@ -312,12 +426,21 @@
           <w:szCs w:val="40"/>
         </w:rPr>
       </w:pPr>
-      <w:r>
-        <w:rPr>
-          <w:sz w:val="40"/>
-          <w:szCs w:val="40"/>
-        </w:rPr>
-        <w:t>npm start</w:t>
+      <w:proofErr w:type="spellStart"/>
+      <w:r>
+        <w:rPr>
+          <w:sz w:val="40"/>
+          <w:szCs w:val="40"/>
+        </w:rPr>
+        <w:t>npm</w:t>
+      </w:r>
+      <w:proofErr w:type="spellEnd"/>
+      <w:r>
+        <w:rPr>
+          <w:sz w:val="40"/>
+          <w:szCs w:val="40"/>
+        </w:rPr>
+        <w:t xml:space="preserve"> start</w:t>
       </w:r>
     </w:p>
     <w:p>
@@ -342,42 +465,85 @@
           <w:szCs w:val="40"/>
         </w:rPr>
       </w:pPr>
-      <w:r>
-        <w:rPr>
-          <w:sz w:val="40"/>
-          <w:szCs w:val="40"/>
-        </w:rPr>
-        <w:t xml:space="preserve">npm create vite@latest &lt;folder-name&gt; -- --template react </w:t>
-      </w:r>
-    </w:p>
-    <w:p>
-      <w:pPr>
-        <w:rPr>
-          <w:sz w:val="40"/>
-          <w:szCs w:val="40"/>
-        </w:rPr>
-      </w:pPr>
-      <w:r>
-        <w:rPr>
-          <w:sz w:val="40"/>
-          <w:szCs w:val="40"/>
-        </w:rPr>
-        <w:t>npm install</w:t>
-      </w:r>
-    </w:p>
-    <w:p>
-      <w:pPr>
-        <w:rPr>
-          <w:sz w:val="40"/>
-          <w:szCs w:val="40"/>
-        </w:rPr>
-      </w:pPr>
-      <w:r>
-        <w:rPr>
-          <w:sz w:val="40"/>
-          <w:szCs w:val="40"/>
-        </w:rPr>
-        <w:t>npm run dev</w:t>
+      <w:proofErr w:type="spellStart"/>
+      <w:r>
+        <w:rPr>
+          <w:sz w:val="40"/>
+          <w:szCs w:val="40"/>
+        </w:rPr>
+        <w:t>npm</w:t>
+      </w:r>
+      <w:proofErr w:type="spellEnd"/>
+      <w:r>
+        <w:rPr>
+          <w:sz w:val="40"/>
+          <w:szCs w:val="40"/>
+        </w:rPr>
+        <w:t xml:space="preserve"> create </w:t>
+      </w:r>
+      <w:proofErr w:type="spellStart"/>
+      <w:r>
+        <w:rPr>
+          <w:sz w:val="40"/>
+          <w:szCs w:val="40"/>
+        </w:rPr>
+        <w:t>vite@latest</w:t>
+      </w:r>
+      <w:proofErr w:type="spellEnd"/>
+      <w:r>
+        <w:rPr>
+          <w:sz w:val="40"/>
+          <w:szCs w:val="40"/>
+        </w:rPr>
+        <w:t xml:space="preserve"> &lt;folder-name&gt; -- --template react </w:t>
+      </w:r>
+    </w:p>
+    <w:p>
+      <w:pPr>
+        <w:rPr>
+          <w:sz w:val="40"/>
+          <w:szCs w:val="40"/>
+        </w:rPr>
+      </w:pPr>
+      <w:proofErr w:type="spellStart"/>
+      <w:r>
+        <w:rPr>
+          <w:sz w:val="40"/>
+          <w:szCs w:val="40"/>
+        </w:rPr>
+        <w:t>npm</w:t>
+      </w:r>
+      <w:proofErr w:type="spellEnd"/>
+      <w:r>
+        <w:rPr>
+          <w:sz w:val="40"/>
+          <w:szCs w:val="40"/>
+        </w:rPr>
+        <w:t xml:space="preserve"> install</w:t>
+      </w:r>
+    </w:p>
+    <w:p>
+      <w:pPr>
+        <w:rPr>
+          <w:sz w:val="40"/>
+          <w:szCs w:val="40"/>
+        </w:rPr>
+      </w:pPr>
+      <w:proofErr w:type="spellStart"/>
+      <w:r>
+        <w:rPr>
+          <w:sz w:val="40"/>
+          <w:szCs w:val="40"/>
+        </w:rPr>
+        <w:t>npm</w:t>
+      </w:r>
+      <w:proofErr w:type="spellEnd"/>
+      <w:r>
+        <w:rPr>
+          <w:sz w:val="40"/>
+          <w:szCs w:val="40"/>
+        </w:rPr>
+        <w:t xml:space="preserve"> run dev</w:t>
       </w:r>
     </w:p>
     <w:p>
@@ -407,23 +573,57 @@
           <w:sz w:val="40"/>
           <w:szCs w:val="40"/>
         </w:rPr>
-        <w:t xml:space="preserve">+ESlint: </w:t>
-      </w:r>
-    </w:p>
-    <w:p>
-      <w:pPr>
-        <w:rPr>
-          <w:sz w:val="40"/>
-          <w:szCs w:val="40"/>
-        </w:rPr>
-      </w:pPr>
-      <w:r>
-        <w:rPr>
-          <w:sz w:val="40"/>
-          <w:szCs w:val="40"/>
-        </w:rPr>
-        <w:t>Create .eslintrc.json</w:t>
-      </w:r>
+        <w:t>+</w:t>
+      </w:r>
+      <w:proofErr w:type="spellStart"/>
+      <w:r>
+        <w:rPr>
+          <w:sz w:val="40"/>
+          <w:szCs w:val="40"/>
+        </w:rPr>
+        <w:t>ESlint</w:t>
+      </w:r>
+      <w:proofErr w:type="spellEnd"/>
+      <w:r>
+        <w:rPr>
+          <w:sz w:val="40"/>
+          <w:szCs w:val="40"/>
+        </w:rPr>
+        <w:t xml:space="preserve">: </w:t>
+      </w:r>
+    </w:p>
+    <w:p>
+      <w:pPr>
+        <w:rPr>
+          <w:sz w:val="40"/>
+          <w:szCs w:val="40"/>
+        </w:rPr>
+      </w:pPr>
+      <w:proofErr w:type="gramStart"/>
+      <w:r>
+        <w:rPr>
+          <w:sz w:val="40"/>
+          <w:szCs w:val="40"/>
+        </w:rPr>
+        <w:t>Create .</w:t>
+      </w:r>
+      <w:proofErr w:type="spellStart"/>
+      <w:r>
+        <w:rPr>
+          <w:sz w:val="40"/>
+          <w:szCs w:val="40"/>
+        </w:rPr>
+        <w:t>eslintrc</w:t>
+      </w:r>
+      <w:proofErr w:type="gramEnd"/>
+      <w:r>
+        <w:rPr>
+          <w:sz w:val="40"/>
+          <w:szCs w:val="40"/>
+        </w:rPr>
+        <w:t>.json</w:t>
+      </w:r>
+      <w:proofErr w:type="spellEnd"/>
     </w:p>
     <w:p>
       <w:pPr>
@@ -543,12 +743,69 @@
           <w:szCs w:val="40"/>
         </w:rPr>
       </w:pPr>
-      <w:r>
-        <w:rPr>
-          <w:sz w:val="40"/>
-          <w:szCs w:val="40"/>
-        </w:rPr>
-        <w:t>npm install eslint@8 vite-plugin-eslint eslint-config-react-app --save-dev</w:t>
+      <w:proofErr w:type="spellStart"/>
+      <w:r>
+        <w:rPr>
+          <w:sz w:val="40"/>
+          <w:szCs w:val="40"/>
+        </w:rPr>
+        <w:t>npm</w:t>
+      </w:r>
+      <w:proofErr w:type="spellEnd"/>
+      <w:r>
+        <w:rPr>
+          <w:sz w:val="40"/>
+          <w:szCs w:val="40"/>
+        </w:rPr>
+        <w:t xml:space="preserve"> install eslint@8 </w:t>
+      </w:r>
+      <w:proofErr w:type="spellStart"/>
+      <w:r>
+        <w:rPr>
+          <w:sz w:val="40"/>
+          <w:szCs w:val="40"/>
+        </w:rPr>
+        <w:t>vite</w:t>
+      </w:r>
+      <w:proofErr w:type="spellEnd"/>
+      <w:r>
+        <w:rPr>
+          <w:sz w:val="40"/>
+          <w:szCs w:val="40"/>
+        </w:rPr>
+        <w:t>-plugin-</w:t>
+      </w:r>
+      <w:proofErr w:type="spellStart"/>
+      <w:r>
+        <w:rPr>
+          <w:sz w:val="40"/>
+          <w:szCs w:val="40"/>
+        </w:rPr>
+        <w:t>eslint</w:t>
+      </w:r>
+      <w:proofErr w:type="spellEnd"/>
+      <w:r>
+        <w:rPr>
+          <w:sz w:val="40"/>
+          <w:szCs w:val="40"/>
+        </w:rPr>
+        <w:t xml:space="preserve"> </w:t>
+      </w:r>
+      <w:proofErr w:type="spellStart"/>
+      <w:r>
+        <w:rPr>
+          <w:sz w:val="40"/>
+          <w:szCs w:val="40"/>
+        </w:rPr>
+        <w:t>eslint</w:t>
+      </w:r>
+      <w:proofErr w:type="spellEnd"/>
+      <w:r>
+        <w:rPr>
+          <w:sz w:val="40"/>
+          <w:szCs w:val="40"/>
+        </w:rPr>
+        <w:t>-config-react-app --save-dev</w:t>
       </w:r>
     </w:p>
     <w:p>
@@ -584,13 +841,38 @@
           <w:szCs w:val="40"/>
         </w:rPr>
       </w:pPr>
+      <w:proofErr w:type="spellStart"/>
       <w:r>
         <w:rPr>
           <w:sz w:val="40"/>
           <w:szCs w:val="40"/>
         </w:rPr>
         <w:lastRenderedPageBreak/>
-        <w:t>npm i react-router-dom@6</w:t>
+        <w:t>npm</w:t>
+      </w:r>
+      <w:proofErr w:type="spellEnd"/>
+      <w:r>
+        <w:rPr>
+          <w:sz w:val="40"/>
+          <w:szCs w:val="40"/>
+        </w:rPr>
+        <w:t xml:space="preserve"> </w:t>
+      </w:r>
+      <w:proofErr w:type="spellStart"/>
+      <w:r>
+        <w:rPr>
+          <w:sz w:val="40"/>
+          <w:szCs w:val="40"/>
+        </w:rPr>
+        <w:t>i</w:t>
+      </w:r>
+      <w:proofErr w:type="spellEnd"/>
+      <w:r>
+        <w:rPr>
+          <w:sz w:val="40"/>
+          <w:szCs w:val="40"/>
+        </w:rPr>
+        <w:t xml:space="preserve"> react-router-dom@6</w:t>
       </w:r>
     </w:p>
     <w:p>
@@ -645,8 +927,17 @@
           <w:sz w:val="40"/>
           <w:szCs w:val="40"/>
         </w:rPr>
-        <w:t>leafletjs.com/examples/quick-start</w:t>
-      </w:r>
+        <w:t>leafletjs.com/examples/</w:t>
+      </w:r>
+      <w:proofErr w:type="gramStart"/>
+      <w:r>
+        <w:rPr>
+          <w:sz w:val="40"/>
+          <w:szCs w:val="40"/>
+        </w:rPr>
+        <w:t>quick-start</w:t>
+      </w:r>
+      <w:proofErr w:type="gramEnd"/>
     </w:p>
     <w:p>
       <w:pPr>
@@ -670,13 +961,23 @@
           <w:szCs w:val="40"/>
         </w:rPr>
       </w:pPr>
-      <w:r>
-        <w:rPr>
-          <w:sz w:val="40"/>
-          <w:szCs w:val="40"/>
-        </w:rPr>
-        <w:t xml:space="preserve">npm </w:t>
-      </w:r>
+      <w:proofErr w:type="spellStart"/>
+      <w:r>
+        <w:rPr>
+          <w:sz w:val="40"/>
+          <w:szCs w:val="40"/>
+        </w:rPr>
+        <w:t>npm</w:t>
+      </w:r>
+      <w:proofErr w:type="spellEnd"/>
+      <w:r>
+        <w:rPr>
+          <w:sz w:val="40"/>
+          <w:szCs w:val="40"/>
+        </w:rPr>
+        <w:t xml:space="preserve"> </w:t>
+      </w:r>
+      <w:proofErr w:type="spellStart"/>
       <w:r>
         <w:rPr>
           <w:sz w:val="40"/>
@@ -684,6 +985,7 @@
         </w:rPr>
         <w:t>i</w:t>
       </w:r>
+      <w:proofErr w:type="spellEnd"/>
       <w:r>
         <w:rPr>
           <w:sz w:val="40"/>
@@ -704,8 +1006,9 @@
           <w:sz w:val="40"/>
           <w:szCs w:val="40"/>
         </w:rPr>
-        <w:t>-</w:t>
-      </w:r>
+        <w:t>+</w:t>
+      </w:r>
+      <w:proofErr w:type="spellStart"/>
       <w:r>
         <w:rPr>
           <w:b/>
@@ -715,6 +1018,7 @@
         </w:rPr>
         <w:t>Datepicker</w:t>
       </w:r>
+      <w:proofErr w:type="spellEnd"/>
       <w:r>
         <w:rPr>
           <w:sz w:val="40"/>
@@ -744,21 +1048,331 @@
           <w:szCs w:val="40"/>
         </w:rPr>
       </w:pPr>
-      <w:r>
-        <w:rPr>
-          <w:sz w:val="40"/>
-          <w:szCs w:val="40"/>
-        </w:rPr>
-        <w:t>npm i react-datepicker</w:t>
-      </w:r>
-    </w:p>
-    <w:p>
-      <w:pPr>
-        <w:rPr>
-          <w:sz w:val="40"/>
-          <w:szCs w:val="40"/>
-        </w:rPr>
-      </w:pPr>
+      <w:proofErr w:type="spellStart"/>
+      <w:r>
+        <w:rPr>
+          <w:sz w:val="40"/>
+          <w:szCs w:val="40"/>
+        </w:rPr>
+        <w:t>npm</w:t>
+      </w:r>
+      <w:proofErr w:type="spellEnd"/>
+      <w:r>
+        <w:rPr>
+          <w:sz w:val="40"/>
+          <w:szCs w:val="40"/>
+        </w:rPr>
+        <w:t xml:space="preserve"> </w:t>
+      </w:r>
+      <w:proofErr w:type="spellStart"/>
+      <w:r>
+        <w:rPr>
+          <w:sz w:val="40"/>
+          <w:szCs w:val="40"/>
+        </w:rPr>
+        <w:t>i</w:t>
+      </w:r>
+      <w:proofErr w:type="spellEnd"/>
+      <w:r>
+        <w:rPr>
+          <w:sz w:val="40"/>
+          <w:szCs w:val="40"/>
+        </w:rPr>
+        <w:t xml:space="preserve"> react-</w:t>
+      </w:r>
+      <w:proofErr w:type="spellStart"/>
+      <w:r>
+        <w:rPr>
+          <w:sz w:val="40"/>
+          <w:szCs w:val="40"/>
+        </w:rPr>
+        <w:t>datepicker</w:t>
+      </w:r>
+      <w:proofErr w:type="spellEnd"/>
+    </w:p>
+    <w:p>
+      <w:pPr>
+        <w:rPr>
+          <w:sz w:val="40"/>
+          <w:szCs w:val="40"/>
+        </w:rPr>
+      </w:pPr>
+      <w:r>
+        <w:rPr>
+          <w:sz w:val="40"/>
+          <w:szCs w:val="40"/>
+        </w:rPr>
+        <w:t>+Redux</w:t>
+      </w:r>
+      <w:r>
+        <w:rPr>
+          <w:sz w:val="40"/>
+          <w:szCs w:val="40"/>
+        </w:rPr>
+        <w:t xml:space="preserve">: </w:t>
+      </w:r>
+      <w:proofErr w:type="spellStart"/>
+      <w:r>
+        <w:rPr>
+          <w:sz w:val="40"/>
+          <w:szCs w:val="40"/>
+        </w:rPr>
+        <w:t>npm</w:t>
+      </w:r>
+      <w:proofErr w:type="spellEnd"/>
+      <w:r>
+        <w:rPr>
+          <w:sz w:val="40"/>
+          <w:szCs w:val="40"/>
+        </w:rPr>
+        <w:t xml:space="preserve"> i redux</w:t>
+      </w:r>
+    </w:p>
+    <w:p>
+      <w:pPr>
+        <w:rPr>
+          <w:sz w:val="40"/>
+          <w:szCs w:val="40"/>
+        </w:rPr>
+      </w:pPr>
+      <w:proofErr w:type="spellStart"/>
+      <w:r>
+        <w:rPr>
+          <w:sz w:val="40"/>
+          <w:szCs w:val="40"/>
+        </w:rPr>
+        <w:t>npm</w:t>
+      </w:r>
+      <w:proofErr w:type="spellEnd"/>
+      <w:r>
+        <w:rPr>
+          <w:sz w:val="40"/>
+          <w:szCs w:val="40"/>
+        </w:rPr>
+        <w:t xml:space="preserve"> </w:t>
+      </w:r>
+      <w:proofErr w:type="spellStart"/>
+      <w:r>
+        <w:rPr>
+          <w:sz w:val="40"/>
+          <w:szCs w:val="40"/>
+        </w:rPr>
+        <w:t>i</w:t>
+      </w:r>
+      <w:proofErr w:type="spellEnd"/>
+      <w:r>
+        <w:rPr>
+          <w:sz w:val="40"/>
+          <w:szCs w:val="40"/>
+        </w:rPr>
+        <w:t xml:space="preserve"> react-redux </w:t>
+      </w:r>
+    </w:p>
+    <w:p>
+      <w:pPr>
+        <w:rPr>
+          <w:sz w:val="40"/>
+          <w:szCs w:val="40"/>
+        </w:rPr>
+      </w:pPr>
+      <w:proofErr w:type="spellStart"/>
+      <w:r>
+        <w:rPr>
+          <w:sz w:val="40"/>
+          <w:szCs w:val="40"/>
+        </w:rPr>
+        <w:t>npm</w:t>
+      </w:r>
+      <w:proofErr w:type="spellEnd"/>
+      <w:r>
+        <w:rPr>
+          <w:sz w:val="40"/>
+          <w:szCs w:val="40"/>
+        </w:rPr>
+        <w:t xml:space="preserve"> </w:t>
+      </w:r>
+      <w:proofErr w:type="spellStart"/>
+      <w:r>
+        <w:rPr>
+          <w:sz w:val="40"/>
+          <w:szCs w:val="40"/>
+        </w:rPr>
+        <w:t>i</w:t>
+      </w:r>
+      <w:proofErr w:type="spellEnd"/>
+      <w:r>
+        <w:rPr>
+          <w:sz w:val="40"/>
+          <w:szCs w:val="40"/>
+        </w:rPr>
+        <w:t xml:space="preserve"> redux-</w:t>
+      </w:r>
+      <w:proofErr w:type="spellStart"/>
+      <w:r>
+        <w:rPr>
+          <w:sz w:val="40"/>
+          <w:szCs w:val="40"/>
+        </w:rPr>
+        <w:t>thunk</w:t>
+      </w:r>
+      <w:proofErr w:type="spellEnd"/>
+    </w:p>
+    <w:p>
+      <w:pPr>
+        <w:rPr>
+          <w:sz w:val="40"/>
+          <w:szCs w:val="40"/>
+        </w:rPr>
+      </w:pPr>
+      <w:r>
+        <w:rPr>
+          <w:sz w:val="40"/>
+          <w:szCs w:val="40"/>
+        </w:rPr>
+        <w:t xml:space="preserve">Redux </w:t>
+      </w:r>
+      <w:proofErr w:type="spellStart"/>
+      <w:r>
+        <w:rPr>
+          <w:sz w:val="40"/>
+          <w:szCs w:val="40"/>
+        </w:rPr>
+        <w:t>DevTool</w:t>
+      </w:r>
+      <w:proofErr w:type="spellEnd"/>
+      <w:r>
+        <w:rPr>
+          <w:sz w:val="40"/>
+          <w:szCs w:val="40"/>
+        </w:rPr>
+        <w:t xml:space="preserve">: download extension and: </w:t>
+      </w:r>
+      <w:proofErr w:type="spellStart"/>
+      <w:r>
+        <w:rPr>
+          <w:sz w:val="40"/>
+          <w:szCs w:val="40"/>
+        </w:rPr>
+        <w:t>npm</w:t>
+      </w:r>
+      <w:proofErr w:type="spellEnd"/>
+      <w:r>
+        <w:rPr>
+          <w:sz w:val="40"/>
+          <w:szCs w:val="40"/>
+        </w:rPr>
+        <w:t xml:space="preserve"> </w:t>
+      </w:r>
+      <w:proofErr w:type="spellStart"/>
+      <w:r>
+        <w:rPr>
+          <w:sz w:val="40"/>
+          <w:szCs w:val="40"/>
+        </w:rPr>
+        <w:t>i</w:t>
+      </w:r>
+      <w:proofErr w:type="spellEnd"/>
+      <w:r>
+        <w:rPr>
+          <w:sz w:val="40"/>
+          <w:szCs w:val="40"/>
+        </w:rPr>
+        <w:t xml:space="preserve"> redux-</w:t>
+      </w:r>
+      <w:proofErr w:type="spellStart"/>
+      <w:r>
+        <w:rPr>
+          <w:sz w:val="40"/>
+          <w:szCs w:val="40"/>
+        </w:rPr>
+        <w:t>devtools</w:t>
+      </w:r>
+      <w:proofErr w:type="spellEnd"/>
+      <w:r>
+        <w:rPr>
+          <w:sz w:val="40"/>
+          <w:szCs w:val="40"/>
+        </w:rPr>
+        <w:t>-extension</w:t>
+      </w:r>
+    </w:p>
+    <w:p>
+      <w:pPr>
+        <w:rPr>
+          <w:sz w:val="40"/>
+          <w:szCs w:val="40"/>
+        </w:rPr>
+      </w:pPr>
+      <w:r>
+        <w:rPr>
+          <w:sz w:val="40"/>
+          <w:szCs w:val="40"/>
+        </w:rPr>
+        <w:t xml:space="preserve">Redux Toolkit: </w:t>
+      </w:r>
+      <w:proofErr w:type="spellStart"/>
+      <w:r>
+        <w:rPr>
+          <w:sz w:val="40"/>
+          <w:szCs w:val="40"/>
+        </w:rPr>
+        <w:t>npm</w:t>
+      </w:r>
+      <w:proofErr w:type="spellEnd"/>
+      <w:r>
+        <w:rPr>
+          <w:sz w:val="40"/>
+          <w:szCs w:val="40"/>
+        </w:rPr>
+        <w:t xml:space="preserve"> </w:t>
+      </w:r>
+      <w:proofErr w:type="spellStart"/>
+      <w:proofErr w:type="gramStart"/>
+      <w:r>
+        <w:rPr>
+          <w:sz w:val="40"/>
+          <w:szCs w:val="40"/>
+        </w:rPr>
+        <w:t>i</w:t>
+      </w:r>
+      <w:proofErr w:type="spellEnd"/>
+      <w:r>
+        <w:rPr>
+          <w:sz w:val="40"/>
+          <w:szCs w:val="40"/>
+        </w:rPr>
+        <w:t xml:space="preserve"> @</w:t>
+      </w:r>
+      <w:proofErr w:type="gramEnd"/>
+      <w:r>
+        <w:rPr>
+          <w:sz w:val="40"/>
+          <w:szCs w:val="40"/>
+        </w:rPr>
+        <w:t>reduxjs/toolkit</w:t>
+      </w:r>
+    </w:p>
+    <w:p>
+      <w:pPr>
+        <w:rPr>
+          <w:sz w:val="40"/>
+          <w:szCs w:val="40"/>
+        </w:rPr>
+      </w:pPr>
+      <w:r>
+        <w:rPr>
+          <w:sz w:val="40"/>
+          <w:szCs w:val="40"/>
+        </w:rPr>
+        <w:t xml:space="preserve">-Frank Furter: </w:t>
+      </w:r>
+      <w:r>
+        <w:rPr>
+          <w:sz w:val="40"/>
+          <w:szCs w:val="40"/>
+        </w:rPr>
+        <w:t>https://frankfurter.dev/</w:t>
+      </w:r>
     </w:p>
     <w:sectPr>
       <w:pgSz w:w="12240" w:h="15840"/>

</xml_diff>

<commit_message>
Ultimate React Course: update section 23
</commit_message>
<xml_diff>
--- a/3.React/UltimateReactCourse/Document/0.docx
+++ b/3.React/UltimateReactCourse/Document/0.docx
@@ -14,23 +14,7 @@
           <w:sz w:val="40"/>
           <w:szCs w:val="40"/>
         </w:rPr>
-        <w:t>-</w:t>
-      </w:r>
-      <w:proofErr w:type="spellStart"/>
-      <w:r>
-        <w:rPr>
-          <w:sz w:val="40"/>
-          <w:szCs w:val="40"/>
-        </w:rPr>
-        <w:t>Github</w:t>
-      </w:r>
-      <w:proofErr w:type="spellEnd"/>
-      <w:r>
-        <w:rPr>
-          <w:sz w:val="40"/>
-          <w:szCs w:val="40"/>
-        </w:rPr>
-        <w:t xml:space="preserve">: </w:t>
+        <w:t xml:space="preserve">-Github: </w:t>
       </w:r>
       <w:hyperlink r:id="rId4" w:history="1">
         <w:r>
@@ -202,116 +186,52 @@
           <w:sz w:val="40"/>
           <w:szCs w:val="40"/>
         </w:rPr>
-        <w:t>+</w:t>
-      </w:r>
-      <w:proofErr w:type="spellStart"/>
-      <w:r>
-        <w:rPr>
-          <w:sz w:val="40"/>
-          <w:szCs w:val="40"/>
-        </w:rPr>
-        <w:t>ESLint</w:t>
-      </w:r>
-      <w:proofErr w:type="spellEnd"/>
-      <w:r>
-        <w:rPr>
-          <w:sz w:val="40"/>
-          <w:szCs w:val="40"/>
-        </w:rPr>
-        <w:t>: automatically find errors</w:t>
-      </w:r>
-    </w:p>
-    <w:p>
-      <w:pPr>
-        <w:rPr>
-          <w:sz w:val="40"/>
-          <w:szCs w:val="40"/>
-        </w:rPr>
-      </w:pPr>
-      <w:r>
-        <w:rPr>
-          <w:sz w:val="40"/>
-          <w:szCs w:val="40"/>
-        </w:rPr>
-        <w:t xml:space="preserve">+Prettier-Code </w:t>
-      </w:r>
-      <w:proofErr w:type="gramStart"/>
-      <w:r>
-        <w:rPr>
-          <w:sz w:val="40"/>
-          <w:szCs w:val="40"/>
-        </w:rPr>
-        <w:t>formatter</w:t>
-      </w:r>
-      <w:proofErr w:type="gramEnd"/>
-      <w:r>
-        <w:rPr>
-          <w:sz w:val="40"/>
-          <w:szCs w:val="40"/>
-        </w:rPr>
-        <w:t>: automatically format code</w:t>
-      </w:r>
-    </w:p>
-    <w:p>
-      <w:pPr>
-        <w:rPr>
-          <w:sz w:val="40"/>
-          <w:szCs w:val="40"/>
-        </w:rPr>
-      </w:pPr>
-      <w:r>
-        <w:rPr>
-          <w:sz w:val="40"/>
-          <w:szCs w:val="40"/>
-        </w:rPr>
-        <w:t xml:space="preserve">+One </w:t>
-      </w:r>
-      <w:proofErr w:type="spellStart"/>
-      <w:r>
-        <w:rPr>
-          <w:sz w:val="40"/>
-          <w:szCs w:val="40"/>
-        </w:rPr>
-        <w:t>Monokai</w:t>
-      </w:r>
-      <w:proofErr w:type="spellEnd"/>
-      <w:r>
-        <w:rPr>
-          <w:sz w:val="40"/>
-          <w:szCs w:val="40"/>
-        </w:rPr>
-        <w:t xml:space="preserve"> Theme: Set color theme</w:t>
-      </w:r>
-    </w:p>
-    <w:p>
-      <w:pPr>
-        <w:rPr>
-          <w:sz w:val="40"/>
-          <w:szCs w:val="40"/>
-        </w:rPr>
-      </w:pPr>
-      <w:r>
-        <w:rPr>
-          <w:sz w:val="40"/>
-          <w:szCs w:val="40"/>
-        </w:rPr>
-        <w:t>+Material Icon Theme</w:t>
-      </w:r>
-      <w:proofErr w:type="gramStart"/>
-      <w:r>
-        <w:rPr>
-          <w:sz w:val="40"/>
-          <w:szCs w:val="40"/>
-        </w:rPr>
-        <w:t>:  theme</w:t>
-      </w:r>
-      <w:proofErr w:type="gramEnd"/>
-      <w:r>
-        <w:rPr>
-          <w:sz w:val="40"/>
-          <w:szCs w:val="40"/>
-        </w:rPr>
-        <w:t xml:space="preserve"> for file icons</w:t>
+        <w:t>+ESLint: automatically find errors</w:t>
+      </w:r>
+    </w:p>
+    <w:p>
+      <w:pPr>
+        <w:rPr>
+          <w:sz w:val="40"/>
+          <w:szCs w:val="40"/>
+        </w:rPr>
+      </w:pPr>
+      <w:r>
+        <w:rPr>
+          <w:sz w:val="40"/>
+          <w:szCs w:val="40"/>
+        </w:rPr>
+        <w:t>+Prettier-Code formatter: automatically format code</w:t>
+      </w:r>
+    </w:p>
+    <w:p>
+      <w:pPr>
+        <w:rPr>
+          <w:sz w:val="40"/>
+          <w:szCs w:val="40"/>
+        </w:rPr>
+      </w:pPr>
+      <w:r>
+        <w:rPr>
+          <w:sz w:val="40"/>
+          <w:szCs w:val="40"/>
+        </w:rPr>
+        <w:t>+One Monokai Theme: Set color theme</w:t>
+      </w:r>
+    </w:p>
+    <w:p>
+      <w:pPr>
+        <w:rPr>
+          <w:sz w:val="40"/>
+          <w:szCs w:val="40"/>
+        </w:rPr>
+      </w:pPr>
+      <w:r>
+        <w:rPr>
+          <w:sz w:val="40"/>
+          <w:szCs w:val="40"/>
+        </w:rPr>
+        <w:t>+Material Icon Theme:  theme for file icons</w:t>
       </w:r>
     </w:p>
     <w:p>
@@ -342,55 +262,22 @@
           <w:szCs w:val="40"/>
         </w:rPr>
         <w:lastRenderedPageBreak/>
-        <w:t xml:space="preserve">-Set up </w:t>
-      </w:r>
-      <w:proofErr w:type="gramStart"/>
-      <w:r>
-        <w:rPr>
-          <w:sz w:val="40"/>
-          <w:szCs w:val="40"/>
-        </w:rPr>
-        <w:t>project</w:t>
-      </w:r>
-      <w:proofErr w:type="gramEnd"/>
-      <w:r>
-        <w:rPr>
-          <w:sz w:val="40"/>
-          <w:szCs w:val="40"/>
-        </w:rPr>
-        <w:t xml:space="preserve"> with Create-React-App:</w:t>
-      </w:r>
-    </w:p>
-    <w:p>
-      <w:pPr>
-        <w:rPr>
-          <w:sz w:val="40"/>
-          <w:szCs w:val="40"/>
-        </w:rPr>
-      </w:pPr>
-      <w:proofErr w:type="spellStart"/>
-      <w:r>
-        <w:rPr>
-          <w:sz w:val="40"/>
-          <w:szCs w:val="40"/>
-        </w:rPr>
-        <w:t>npx</w:t>
-      </w:r>
-      <w:proofErr w:type="spellEnd"/>
-      <w:r>
-        <w:rPr>
-          <w:sz w:val="40"/>
-          <w:szCs w:val="40"/>
-        </w:rPr>
-        <w:t xml:space="preserve"> </w:t>
-      </w:r>
-      <w:proofErr w:type="spellStart"/>
-      <w:r>
-        <w:rPr>
-          <w:sz w:val="40"/>
-          <w:szCs w:val="40"/>
-        </w:rPr>
-        <w:t>create-react-app@</w:t>
+        <w:t>-Set up project with Create-React-App:</w:t>
+      </w:r>
+    </w:p>
+    <w:p>
+      <w:pPr>
+        <w:rPr>
+          <w:sz w:val="40"/>
+          <w:szCs w:val="40"/>
+        </w:rPr>
+      </w:pPr>
+      <w:r>
+        <w:rPr>
+          <w:sz w:val="40"/>
+          <w:szCs w:val="40"/>
+        </w:rPr>
+        <w:t>npx create-react-app@</w:t>
       </w:r>
       <w:r>
         <w:rPr>
@@ -401,7 +288,6 @@
         </w:rPr>
         <w:t>version</w:t>
       </w:r>
-      <w:proofErr w:type="spellEnd"/>
       <w:r>
         <w:rPr>
           <w:sz w:val="40"/>
@@ -426,21 +312,12 @@
           <w:szCs w:val="40"/>
         </w:rPr>
       </w:pPr>
-      <w:proofErr w:type="spellStart"/>
-      <w:r>
-        <w:rPr>
-          <w:sz w:val="40"/>
-          <w:szCs w:val="40"/>
-        </w:rPr>
-        <w:t>npm</w:t>
-      </w:r>
-      <w:proofErr w:type="spellEnd"/>
-      <w:r>
-        <w:rPr>
-          <w:sz w:val="40"/>
-          <w:szCs w:val="40"/>
-        </w:rPr>
-        <w:t xml:space="preserve"> start</w:t>
+      <w:r>
+        <w:rPr>
+          <w:sz w:val="40"/>
+          <w:szCs w:val="40"/>
+        </w:rPr>
+        <w:t>npm start</w:t>
       </w:r>
     </w:p>
     <w:p>
@@ -465,85 +342,42 @@
           <w:szCs w:val="40"/>
         </w:rPr>
       </w:pPr>
-      <w:proofErr w:type="spellStart"/>
-      <w:r>
-        <w:rPr>
-          <w:sz w:val="40"/>
-          <w:szCs w:val="40"/>
-        </w:rPr>
-        <w:t>npm</w:t>
-      </w:r>
-      <w:proofErr w:type="spellEnd"/>
-      <w:r>
-        <w:rPr>
-          <w:sz w:val="40"/>
-          <w:szCs w:val="40"/>
-        </w:rPr>
-        <w:t xml:space="preserve"> create </w:t>
-      </w:r>
-      <w:proofErr w:type="spellStart"/>
-      <w:r>
-        <w:rPr>
-          <w:sz w:val="40"/>
-          <w:szCs w:val="40"/>
-        </w:rPr>
-        <w:t>vite@latest</w:t>
-      </w:r>
-      <w:proofErr w:type="spellEnd"/>
-      <w:r>
-        <w:rPr>
-          <w:sz w:val="40"/>
-          <w:szCs w:val="40"/>
-        </w:rPr>
-        <w:t xml:space="preserve"> &lt;folder-name&gt; -- --template react </w:t>
-      </w:r>
-    </w:p>
-    <w:p>
-      <w:pPr>
-        <w:rPr>
-          <w:sz w:val="40"/>
-          <w:szCs w:val="40"/>
-        </w:rPr>
-      </w:pPr>
-      <w:proofErr w:type="spellStart"/>
-      <w:r>
-        <w:rPr>
-          <w:sz w:val="40"/>
-          <w:szCs w:val="40"/>
-        </w:rPr>
-        <w:t>npm</w:t>
-      </w:r>
-      <w:proofErr w:type="spellEnd"/>
-      <w:r>
-        <w:rPr>
-          <w:sz w:val="40"/>
-          <w:szCs w:val="40"/>
-        </w:rPr>
-        <w:t xml:space="preserve"> install</w:t>
-      </w:r>
-    </w:p>
-    <w:p>
-      <w:pPr>
-        <w:rPr>
-          <w:sz w:val="40"/>
-          <w:szCs w:val="40"/>
-        </w:rPr>
-      </w:pPr>
-      <w:proofErr w:type="spellStart"/>
-      <w:r>
-        <w:rPr>
-          <w:sz w:val="40"/>
-          <w:szCs w:val="40"/>
-        </w:rPr>
-        <w:t>npm</w:t>
-      </w:r>
-      <w:proofErr w:type="spellEnd"/>
-      <w:r>
-        <w:rPr>
-          <w:sz w:val="40"/>
-          <w:szCs w:val="40"/>
-        </w:rPr>
-        <w:t xml:space="preserve"> run dev</w:t>
+      <w:r>
+        <w:rPr>
+          <w:sz w:val="40"/>
+          <w:szCs w:val="40"/>
+        </w:rPr>
+        <w:t xml:space="preserve">npm create vite@latest &lt;folder-name&gt; -- --template react </w:t>
+      </w:r>
+    </w:p>
+    <w:p>
+      <w:pPr>
+        <w:rPr>
+          <w:sz w:val="40"/>
+          <w:szCs w:val="40"/>
+        </w:rPr>
+      </w:pPr>
+      <w:r>
+        <w:rPr>
+          <w:sz w:val="40"/>
+          <w:szCs w:val="40"/>
+        </w:rPr>
+        <w:t>npm install</w:t>
+      </w:r>
+    </w:p>
+    <w:p>
+      <w:pPr>
+        <w:rPr>
+          <w:sz w:val="40"/>
+          <w:szCs w:val="40"/>
+        </w:rPr>
+      </w:pPr>
+      <w:r>
+        <w:rPr>
+          <w:sz w:val="40"/>
+          <w:szCs w:val="40"/>
+        </w:rPr>
+        <w:t>npm run dev</w:t>
       </w:r>
     </w:p>
     <w:p>
@@ -573,57 +407,23 @@
           <w:sz w:val="40"/>
           <w:szCs w:val="40"/>
         </w:rPr>
-        <w:t>+</w:t>
-      </w:r>
-      <w:proofErr w:type="spellStart"/>
-      <w:r>
-        <w:rPr>
-          <w:sz w:val="40"/>
-          <w:szCs w:val="40"/>
-        </w:rPr>
-        <w:t>ESlint</w:t>
-      </w:r>
-      <w:proofErr w:type="spellEnd"/>
-      <w:r>
-        <w:rPr>
-          <w:sz w:val="40"/>
-          <w:szCs w:val="40"/>
-        </w:rPr>
-        <w:t xml:space="preserve">: </w:t>
-      </w:r>
-    </w:p>
-    <w:p>
-      <w:pPr>
-        <w:rPr>
-          <w:sz w:val="40"/>
-          <w:szCs w:val="40"/>
-        </w:rPr>
-      </w:pPr>
-      <w:proofErr w:type="gramStart"/>
-      <w:r>
-        <w:rPr>
-          <w:sz w:val="40"/>
-          <w:szCs w:val="40"/>
-        </w:rPr>
-        <w:t>Create .</w:t>
-      </w:r>
-      <w:proofErr w:type="spellStart"/>
-      <w:r>
-        <w:rPr>
-          <w:sz w:val="40"/>
-          <w:szCs w:val="40"/>
-        </w:rPr>
-        <w:t>eslintrc</w:t>
-      </w:r>
-      <w:proofErr w:type="gramEnd"/>
-      <w:r>
-        <w:rPr>
-          <w:sz w:val="40"/>
-          <w:szCs w:val="40"/>
-        </w:rPr>
-        <w:t>.json</w:t>
-      </w:r>
-      <w:proofErr w:type="spellEnd"/>
+        <w:t xml:space="preserve">+ESlint: </w:t>
+      </w:r>
+    </w:p>
+    <w:p>
+      <w:pPr>
+        <w:rPr>
+          <w:sz w:val="40"/>
+          <w:szCs w:val="40"/>
+        </w:rPr>
+      </w:pPr>
+      <w:r>
+        <w:rPr>
+          <w:sz w:val="40"/>
+          <w:szCs w:val="40"/>
+        </w:rPr>
+        <w:t>Create .eslintrc.json</w:t>
+      </w:r>
     </w:p>
     <w:p>
       <w:pPr>
@@ -743,69 +543,12 @@
           <w:szCs w:val="40"/>
         </w:rPr>
       </w:pPr>
-      <w:proofErr w:type="spellStart"/>
-      <w:r>
-        <w:rPr>
-          <w:sz w:val="40"/>
-          <w:szCs w:val="40"/>
-        </w:rPr>
-        <w:t>npm</w:t>
-      </w:r>
-      <w:proofErr w:type="spellEnd"/>
-      <w:r>
-        <w:rPr>
-          <w:sz w:val="40"/>
-          <w:szCs w:val="40"/>
-        </w:rPr>
-        <w:t xml:space="preserve"> install eslint@8 </w:t>
-      </w:r>
-      <w:proofErr w:type="spellStart"/>
-      <w:r>
-        <w:rPr>
-          <w:sz w:val="40"/>
-          <w:szCs w:val="40"/>
-        </w:rPr>
-        <w:t>vite</w:t>
-      </w:r>
-      <w:proofErr w:type="spellEnd"/>
-      <w:r>
-        <w:rPr>
-          <w:sz w:val="40"/>
-          <w:szCs w:val="40"/>
-        </w:rPr>
-        <w:t>-plugin-</w:t>
-      </w:r>
-      <w:proofErr w:type="spellStart"/>
-      <w:r>
-        <w:rPr>
-          <w:sz w:val="40"/>
-          <w:szCs w:val="40"/>
-        </w:rPr>
-        <w:t>eslint</w:t>
-      </w:r>
-      <w:proofErr w:type="spellEnd"/>
-      <w:r>
-        <w:rPr>
-          <w:sz w:val="40"/>
-          <w:szCs w:val="40"/>
-        </w:rPr>
-        <w:t xml:space="preserve"> </w:t>
-      </w:r>
-      <w:proofErr w:type="spellStart"/>
-      <w:r>
-        <w:rPr>
-          <w:sz w:val="40"/>
-          <w:szCs w:val="40"/>
-        </w:rPr>
-        <w:t>eslint</w:t>
-      </w:r>
-      <w:proofErr w:type="spellEnd"/>
-      <w:r>
-        <w:rPr>
-          <w:sz w:val="40"/>
-          <w:szCs w:val="40"/>
-        </w:rPr>
-        <w:t>-config-react-app --save-dev</w:t>
+      <w:r>
+        <w:rPr>
+          <w:sz w:val="40"/>
+          <w:szCs w:val="40"/>
+        </w:rPr>
+        <w:t>npm install eslint@8 vite-plugin-eslint eslint-config-react-app --save-dev</w:t>
       </w:r>
     </w:p>
     <w:p>
@@ -841,38 +584,13 @@
           <w:szCs w:val="40"/>
         </w:rPr>
       </w:pPr>
-      <w:proofErr w:type="spellStart"/>
       <w:r>
         <w:rPr>
           <w:sz w:val="40"/>
           <w:szCs w:val="40"/>
         </w:rPr>
         <w:lastRenderedPageBreak/>
-        <w:t>npm</w:t>
-      </w:r>
-      <w:proofErr w:type="spellEnd"/>
-      <w:r>
-        <w:rPr>
-          <w:sz w:val="40"/>
-          <w:szCs w:val="40"/>
-        </w:rPr>
-        <w:t xml:space="preserve"> </w:t>
-      </w:r>
-      <w:proofErr w:type="spellStart"/>
-      <w:r>
-        <w:rPr>
-          <w:sz w:val="40"/>
-          <w:szCs w:val="40"/>
-        </w:rPr>
-        <w:t>i</w:t>
-      </w:r>
-      <w:proofErr w:type="spellEnd"/>
-      <w:r>
-        <w:rPr>
-          <w:sz w:val="40"/>
-          <w:szCs w:val="40"/>
-        </w:rPr>
-        <w:t xml:space="preserve"> react-router-dom@6</w:t>
+        <w:t>npm i react-router-dom@6</w:t>
       </w:r>
     </w:p>
     <w:p>
@@ -927,17 +645,8 @@
           <w:sz w:val="40"/>
           <w:szCs w:val="40"/>
         </w:rPr>
-        <w:t>leafletjs.com/examples/</w:t>
-      </w:r>
-      <w:proofErr w:type="gramStart"/>
-      <w:r>
-        <w:rPr>
-          <w:sz w:val="40"/>
-          <w:szCs w:val="40"/>
-        </w:rPr>
-        <w:t>quick-start</w:t>
-      </w:r>
-      <w:proofErr w:type="gramEnd"/>
+        <w:t>leafletjs.com/examples/quick-start</w:t>
+      </w:r>
     </w:p>
     <w:p>
       <w:pPr>
@@ -961,23 +670,13 @@
           <w:szCs w:val="40"/>
         </w:rPr>
       </w:pPr>
-      <w:proofErr w:type="spellStart"/>
-      <w:r>
-        <w:rPr>
-          <w:sz w:val="40"/>
-          <w:szCs w:val="40"/>
-        </w:rPr>
-        <w:t>npm</w:t>
-      </w:r>
-      <w:proofErr w:type="spellEnd"/>
-      <w:r>
-        <w:rPr>
-          <w:sz w:val="40"/>
-          <w:szCs w:val="40"/>
-        </w:rPr>
-        <w:t xml:space="preserve"> </w:t>
-      </w:r>
-      <w:proofErr w:type="spellStart"/>
+      <w:r>
+        <w:rPr>
+          <w:sz w:val="40"/>
+          <w:szCs w:val="40"/>
+        </w:rPr>
+        <w:t xml:space="preserve">npm </w:t>
+      </w:r>
       <w:r>
         <w:rPr>
           <w:sz w:val="40"/>
@@ -985,7 +684,6 @@
         </w:rPr>
         <w:t>i</w:t>
       </w:r>
-      <w:proofErr w:type="spellEnd"/>
       <w:r>
         <w:rPr>
           <w:sz w:val="40"/>
@@ -1008,7 +706,6 @@
         </w:rPr>
         <w:t>+</w:t>
       </w:r>
-      <w:proofErr w:type="spellStart"/>
       <w:r>
         <w:rPr>
           <w:b/>
@@ -1018,7 +715,6 @@
         </w:rPr>
         <w:t>Datepicker</w:t>
       </w:r>
-      <w:proofErr w:type="spellEnd"/>
       <w:r>
         <w:rPr>
           <w:sz w:val="40"/>
@@ -1048,47 +744,13 @@
           <w:szCs w:val="40"/>
         </w:rPr>
       </w:pPr>
-      <w:proofErr w:type="spellStart"/>
-      <w:r>
-        <w:rPr>
-          <w:sz w:val="40"/>
-          <w:szCs w:val="40"/>
-        </w:rPr>
-        <w:t>npm</w:t>
-      </w:r>
-      <w:proofErr w:type="spellEnd"/>
-      <w:r>
-        <w:rPr>
-          <w:sz w:val="40"/>
-          <w:szCs w:val="40"/>
-        </w:rPr>
-        <w:t xml:space="preserve"> </w:t>
-      </w:r>
-      <w:proofErr w:type="spellStart"/>
-      <w:r>
-        <w:rPr>
-          <w:sz w:val="40"/>
-          <w:szCs w:val="40"/>
-        </w:rPr>
-        <w:t>i</w:t>
-      </w:r>
-      <w:proofErr w:type="spellEnd"/>
-      <w:r>
-        <w:rPr>
-          <w:sz w:val="40"/>
-          <w:szCs w:val="40"/>
-        </w:rPr>
-        <w:t xml:space="preserve"> react-</w:t>
-      </w:r>
-      <w:proofErr w:type="spellStart"/>
-      <w:r>
-        <w:rPr>
-          <w:sz w:val="40"/>
-          <w:szCs w:val="40"/>
-        </w:rPr>
-        <w:t>datepicker</w:t>
-      </w:r>
-      <w:proofErr w:type="spellEnd"/>
+      <w:r>
+        <w:rPr>
+          <w:sz w:val="40"/>
+          <w:szCs w:val="40"/>
+        </w:rPr>
+        <w:t>npm i react-datepicker</w:t>
+      </w:r>
     </w:p>
     <w:p>
       <w:pPr>
@@ -1109,247 +771,67 @@
           <w:sz w:val="40"/>
           <w:szCs w:val="40"/>
         </w:rPr>
-        <w:t xml:space="preserve">: </w:t>
-      </w:r>
-      <w:proofErr w:type="spellStart"/>
-      <w:r>
-        <w:rPr>
-          <w:sz w:val="40"/>
-          <w:szCs w:val="40"/>
-        </w:rPr>
-        <w:t>npm</w:t>
-      </w:r>
-      <w:proofErr w:type="spellEnd"/>
-      <w:r>
-        <w:rPr>
-          <w:sz w:val="40"/>
-          <w:szCs w:val="40"/>
-        </w:rPr>
-        <w:t xml:space="preserve"> i redux</w:t>
-      </w:r>
-    </w:p>
-    <w:p>
-      <w:pPr>
-        <w:rPr>
-          <w:sz w:val="40"/>
-          <w:szCs w:val="40"/>
-        </w:rPr>
-      </w:pPr>
-      <w:proofErr w:type="spellStart"/>
-      <w:r>
-        <w:rPr>
-          <w:sz w:val="40"/>
-          <w:szCs w:val="40"/>
-        </w:rPr>
-        <w:t>npm</w:t>
-      </w:r>
-      <w:proofErr w:type="spellEnd"/>
-      <w:r>
-        <w:rPr>
-          <w:sz w:val="40"/>
-          <w:szCs w:val="40"/>
-        </w:rPr>
-        <w:t xml:space="preserve"> </w:t>
-      </w:r>
-      <w:proofErr w:type="spellStart"/>
-      <w:r>
-        <w:rPr>
-          <w:sz w:val="40"/>
-          <w:szCs w:val="40"/>
-        </w:rPr>
-        <w:t>i</w:t>
-      </w:r>
-      <w:proofErr w:type="spellEnd"/>
-      <w:r>
-        <w:rPr>
-          <w:sz w:val="40"/>
-          <w:szCs w:val="40"/>
-        </w:rPr>
-        <w:t xml:space="preserve"> react-redux </w:t>
-      </w:r>
-    </w:p>
-    <w:p>
-      <w:pPr>
-        <w:rPr>
-          <w:sz w:val="40"/>
-          <w:szCs w:val="40"/>
-        </w:rPr>
-      </w:pPr>
-      <w:proofErr w:type="spellStart"/>
-      <w:r>
-        <w:rPr>
-          <w:sz w:val="40"/>
-          <w:szCs w:val="40"/>
-        </w:rPr>
-        <w:t>npm</w:t>
-      </w:r>
-      <w:proofErr w:type="spellEnd"/>
-      <w:r>
-        <w:rPr>
-          <w:sz w:val="40"/>
-          <w:szCs w:val="40"/>
-        </w:rPr>
-        <w:t xml:space="preserve"> </w:t>
-      </w:r>
-      <w:proofErr w:type="spellStart"/>
-      <w:r>
-        <w:rPr>
-          <w:sz w:val="40"/>
-          <w:szCs w:val="40"/>
-        </w:rPr>
-        <w:t>i</w:t>
-      </w:r>
-      <w:proofErr w:type="spellEnd"/>
-      <w:r>
-        <w:rPr>
-          <w:sz w:val="40"/>
-          <w:szCs w:val="40"/>
-        </w:rPr>
-        <w:t xml:space="preserve"> redux-</w:t>
-      </w:r>
-      <w:proofErr w:type="spellStart"/>
-      <w:r>
-        <w:rPr>
-          <w:sz w:val="40"/>
-          <w:szCs w:val="40"/>
-        </w:rPr>
-        <w:t>thunk</w:t>
-      </w:r>
-      <w:proofErr w:type="spellEnd"/>
-    </w:p>
-    <w:p>
-      <w:pPr>
-        <w:rPr>
-          <w:sz w:val="40"/>
-          <w:szCs w:val="40"/>
-        </w:rPr>
-      </w:pPr>
-      <w:r>
-        <w:rPr>
-          <w:sz w:val="40"/>
-          <w:szCs w:val="40"/>
-        </w:rPr>
-        <w:t xml:space="preserve">Redux </w:t>
-      </w:r>
-      <w:proofErr w:type="spellStart"/>
-      <w:r>
-        <w:rPr>
-          <w:sz w:val="40"/>
-          <w:szCs w:val="40"/>
-        </w:rPr>
-        <w:t>DevTool</w:t>
-      </w:r>
-      <w:proofErr w:type="spellEnd"/>
-      <w:r>
-        <w:rPr>
-          <w:sz w:val="40"/>
-          <w:szCs w:val="40"/>
-        </w:rPr>
-        <w:t xml:space="preserve">: download extension and: </w:t>
-      </w:r>
-      <w:proofErr w:type="spellStart"/>
-      <w:r>
-        <w:rPr>
-          <w:sz w:val="40"/>
-          <w:szCs w:val="40"/>
-        </w:rPr>
-        <w:t>npm</w:t>
-      </w:r>
-      <w:proofErr w:type="spellEnd"/>
-      <w:r>
-        <w:rPr>
-          <w:sz w:val="40"/>
-          <w:szCs w:val="40"/>
-        </w:rPr>
-        <w:t xml:space="preserve"> </w:t>
-      </w:r>
-      <w:proofErr w:type="spellStart"/>
-      <w:r>
-        <w:rPr>
-          <w:sz w:val="40"/>
-          <w:szCs w:val="40"/>
-        </w:rPr>
-        <w:t>i</w:t>
-      </w:r>
-      <w:proofErr w:type="spellEnd"/>
-      <w:r>
-        <w:rPr>
-          <w:sz w:val="40"/>
-          <w:szCs w:val="40"/>
-        </w:rPr>
-        <w:t xml:space="preserve"> redux-</w:t>
-      </w:r>
-      <w:proofErr w:type="spellStart"/>
-      <w:r>
-        <w:rPr>
-          <w:sz w:val="40"/>
-          <w:szCs w:val="40"/>
-        </w:rPr>
-        <w:t>devtools</w:t>
-      </w:r>
-      <w:proofErr w:type="spellEnd"/>
-      <w:r>
-        <w:rPr>
-          <w:sz w:val="40"/>
-          <w:szCs w:val="40"/>
-        </w:rPr>
-        <w:t>-extension</w:t>
-      </w:r>
-    </w:p>
-    <w:p>
-      <w:pPr>
-        <w:rPr>
-          <w:sz w:val="40"/>
-          <w:szCs w:val="40"/>
-        </w:rPr>
-      </w:pPr>
-      <w:r>
-        <w:rPr>
-          <w:sz w:val="40"/>
-          <w:szCs w:val="40"/>
-        </w:rPr>
-        <w:t xml:space="preserve">Redux Toolkit: </w:t>
-      </w:r>
-      <w:proofErr w:type="spellStart"/>
-      <w:r>
-        <w:rPr>
-          <w:sz w:val="40"/>
-          <w:szCs w:val="40"/>
-        </w:rPr>
-        <w:t>npm</w:t>
-      </w:r>
-      <w:proofErr w:type="spellEnd"/>
-      <w:r>
-        <w:rPr>
-          <w:sz w:val="40"/>
-          <w:szCs w:val="40"/>
-        </w:rPr>
-        <w:t xml:space="preserve"> </w:t>
-      </w:r>
-      <w:proofErr w:type="spellStart"/>
-      <w:proofErr w:type="gramStart"/>
-      <w:r>
-        <w:rPr>
-          <w:sz w:val="40"/>
-          <w:szCs w:val="40"/>
-        </w:rPr>
-        <w:t>i</w:t>
-      </w:r>
-      <w:proofErr w:type="spellEnd"/>
-      <w:r>
-        <w:rPr>
-          <w:sz w:val="40"/>
-          <w:szCs w:val="40"/>
-        </w:rPr>
-        <w:t xml:space="preserve"> @</w:t>
-      </w:r>
-      <w:proofErr w:type="gramEnd"/>
-      <w:r>
-        <w:rPr>
-          <w:sz w:val="40"/>
-          <w:szCs w:val="40"/>
-        </w:rPr>
-        <w:t>reduxjs/toolkit</w:t>
+        <w:t>: npm i redux</w:t>
+      </w:r>
+    </w:p>
+    <w:p>
+      <w:pPr>
+        <w:rPr>
+          <w:sz w:val="40"/>
+          <w:szCs w:val="40"/>
+        </w:rPr>
+      </w:pPr>
+      <w:r>
+        <w:rPr>
+          <w:sz w:val="40"/>
+          <w:szCs w:val="40"/>
+        </w:rPr>
+        <w:t xml:space="preserve">npm i react-redux </w:t>
+      </w:r>
+    </w:p>
+    <w:p>
+      <w:pPr>
+        <w:rPr>
+          <w:sz w:val="40"/>
+          <w:szCs w:val="40"/>
+        </w:rPr>
+      </w:pPr>
+      <w:r>
+        <w:rPr>
+          <w:sz w:val="40"/>
+          <w:szCs w:val="40"/>
+        </w:rPr>
+        <w:t>npm i redux-thunk</w:t>
+      </w:r>
+    </w:p>
+    <w:p>
+      <w:pPr>
+        <w:rPr>
+          <w:sz w:val="40"/>
+          <w:szCs w:val="40"/>
+        </w:rPr>
+      </w:pPr>
+      <w:r>
+        <w:rPr>
+          <w:sz w:val="40"/>
+          <w:szCs w:val="40"/>
+        </w:rPr>
+        <w:t>Redux DevTool: download extension and: npm i redux-devtools-extension</w:t>
+      </w:r>
+    </w:p>
+    <w:p>
+      <w:pPr>
+        <w:rPr>
+          <w:sz w:val="40"/>
+          <w:szCs w:val="40"/>
+        </w:rPr>
+      </w:pPr>
+      <w:r>
+        <w:rPr>
+          <w:sz w:val="40"/>
+          <w:szCs w:val="40"/>
+        </w:rPr>
+        <w:t>Redux Toolkit: npm i @reduxjs/toolkit</w:t>
       </w:r>
     </w:p>
     <w:p>
@@ -1366,12 +848,129 @@
         </w:rPr>
         <w:t xml:space="preserve">-Frank Furter: </w:t>
       </w:r>
-      <w:r>
-        <w:rPr>
-          <w:sz w:val="40"/>
-          <w:szCs w:val="40"/>
-        </w:rPr>
-        <w:t>https://frankfurter.dev/</w:t>
+      <w:hyperlink r:id="rId11" w:history="1">
+        <w:r>
+          <w:rPr>
+            <w:rStyle w:val="Hyperlink"/>
+            <w:sz w:val="40"/>
+            <w:szCs w:val="40"/>
+          </w:rPr>
+          <w:t>https://frankfurter.dev/</w:t>
+        </w:r>
+      </w:hyperlink>
+    </w:p>
+    <w:p>
+      <w:pPr>
+        <w:rPr>
+          <w:sz w:val="40"/>
+          <w:szCs w:val="40"/>
+        </w:rPr>
+      </w:pPr>
+      <w:r>
+        <w:rPr>
+          <w:sz w:val="40"/>
+          <w:szCs w:val="40"/>
+        </w:rPr>
+        <w:t xml:space="preserve">-Tailwind: </w:t>
+      </w:r>
+      <w:hyperlink r:id="rId12" w:history="1">
+        <w:r>
+          <w:rPr>
+            <w:rStyle w:val="Hyperlink"/>
+            <w:sz w:val="40"/>
+            <w:szCs w:val="40"/>
+          </w:rPr>
+          <w:t>https://v3.tailwindcss.com/docs/guides/vite</w:t>
+        </w:r>
+      </w:hyperlink>
+    </w:p>
+    <w:p>
+      <w:pPr>
+        <w:rPr>
+          <w:sz w:val="40"/>
+          <w:szCs w:val="40"/>
+        </w:rPr>
+      </w:pPr>
+      <w:r>
+        <w:rPr>
+          <w:sz w:val="40"/>
+          <w:szCs w:val="40"/>
+        </w:rPr>
+        <w:t>bradlc.vscode-tailwindcss</w:t>
+      </w:r>
+    </w:p>
+    <w:p>
+      <w:pPr>
+        <w:rPr>
+          <w:sz w:val="40"/>
+          <w:szCs w:val="40"/>
+        </w:rPr>
+      </w:pPr>
+      <w:r>
+        <w:rPr>
+          <w:sz w:val="40"/>
+          <w:szCs w:val="40"/>
+        </w:rPr>
+        <w:lastRenderedPageBreak/>
+        <w:t xml:space="preserve">+Tailwind Prettier Extension: </w:t>
+      </w:r>
+      <w:hyperlink r:id="rId13" w:history="1">
+        <w:r>
+          <w:rPr>
+            <w:rStyle w:val="Hyperlink"/>
+            <w:sz w:val="40"/>
+            <w:szCs w:val="40"/>
+          </w:rPr>
+          <w:t>https://github.com/tailwindlabs/prettier-plugin-tailwindcss?tab=readme-ov-file</w:t>
+        </w:r>
+      </w:hyperlink>
+    </w:p>
+    <w:p>
+      <w:pPr>
+        <w:rPr>
+          <w:sz w:val="40"/>
+          <w:szCs w:val="40"/>
+        </w:rPr>
+      </w:pPr>
+      <w:r>
+        <w:rPr>
+          <w:noProof/>
+        </w:rPr>
+        <w:drawing>
+          <wp:inline distT="0" distB="0" distL="0" distR="0" wp14:anchorId="48966446" wp14:editId="5A0E8845">
+            <wp:extent cx="5581934" cy="738891"/>
+            <wp:effectExtent l="0" t="0" r="0" b="4445"/>
+            <wp:docPr id="1790000188" name="Picture 1" descr="A screen shot of a computer&#10;&#10;AI-generated content may be incorrect."/>
+            <wp:cNvGraphicFramePr>
+              <a:graphicFrameLocks xmlns:a="http://schemas.openxmlformats.org/drawingml/2006/main" noChangeAspect="1"/>
+            </wp:cNvGraphicFramePr>
+            <a:graphic xmlns:a="http://schemas.openxmlformats.org/drawingml/2006/main">
+              <a:graphicData uri="http://schemas.openxmlformats.org/drawingml/2006/picture">
+                <pic:pic xmlns:pic="http://schemas.openxmlformats.org/drawingml/2006/picture">
+                  <pic:nvPicPr>
+                    <pic:cNvPr id="1790000188" name="Picture 1" descr="A screen shot of a computer&#10;&#10;AI-generated content may be incorrect."/>
+                    <pic:cNvPicPr/>
+                  </pic:nvPicPr>
+                  <pic:blipFill>
+                    <a:blip r:embed="rId14"/>
+                    <a:stretch>
+                      <a:fillRect/>
+                    </a:stretch>
+                  </pic:blipFill>
+                  <pic:spPr>
+                    <a:xfrm>
+                      <a:off x="0" y="0"/>
+                      <a:ext cx="5595267" cy="740656"/>
+                    </a:xfrm>
+                    <a:prstGeom prst="rect">
+                      <a:avLst/>
+                    </a:prstGeom>
+                  </pic:spPr>
+                </pic:pic>
+              </a:graphicData>
+            </a:graphic>
+          </wp:inline>
+        </w:drawing>
       </w:r>
     </w:p>
     <w:sectPr>

</xml_diff>

<commit_message>
Ultimate React Course: Update environment setup
</commit_message>
<xml_diff>
--- a/3.React/UltimateReactCourse/Document/0.docx
+++ b/3.React/UltimateReactCourse/Document/0.docx
@@ -262,6 +262,81 @@
           <w:szCs w:val="40"/>
         </w:rPr>
         <w:lastRenderedPageBreak/>
+        <w:t>+In VS code Setting:</w:t>
+      </w:r>
+    </w:p>
+    <w:p>
+      <w:pPr>
+        <w:rPr>
+          <w:sz w:val="40"/>
+          <w:szCs w:val="40"/>
+        </w:rPr>
+      </w:pPr>
+      <w:r>
+        <w:rPr>
+          <w:sz w:val="40"/>
+          <w:szCs w:val="40"/>
+        </w:rPr>
+        <w:t>Files: auto save: onFocusChange</w:t>
+      </w:r>
+    </w:p>
+    <w:p>
+      <w:pPr>
+        <w:rPr>
+          <w:sz w:val="40"/>
+          <w:szCs w:val="40"/>
+        </w:rPr>
+      </w:pPr>
+      <w:r>
+        <w:rPr>
+          <w:sz w:val="40"/>
+          <w:szCs w:val="40"/>
+        </w:rPr>
+        <w:t>Editor: Default Formatter: Prettier</w:t>
+      </w:r>
+    </w:p>
+    <w:p>
+      <w:pPr>
+        <w:rPr>
+          <w:sz w:val="40"/>
+          <w:szCs w:val="40"/>
+        </w:rPr>
+      </w:pPr>
+      <w:r>
+        <w:rPr>
+          <w:sz w:val="40"/>
+          <w:szCs w:val="40"/>
+        </w:rPr>
+        <w:t>Editor: Format on Save: check boxed</w:t>
+      </w:r>
+    </w:p>
+    <w:p>
+      <w:pPr>
+        <w:rPr>
+          <w:sz w:val="40"/>
+          <w:szCs w:val="40"/>
+        </w:rPr>
+      </w:pPr>
+      <w:r>
+        <w:rPr>
+          <w:sz w:val="40"/>
+          <w:szCs w:val="40"/>
+        </w:rPr>
+        <w:t>Eslint Run: onSave</w:t>
+      </w:r>
+    </w:p>
+    <w:p>
+      <w:pPr>
+        <w:rPr>
+          <w:sz w:val="40"/>
+          <w:szCs w:val="40"/>
+        </w:rPr>
+      </w:pPr>
+      <w:r>
+        <w:rPr>
+          <w:sz w:val="40"/>
+          <w:szCs w:val="40"/>
+        </w:rPr>
         <w:t>-Set up project with Create-React-App:</w:t>
       </w:r>
     </w:p>
@@ -485,6 +560,7 @@
           <w:sz w:val="40"/>
           <w:szCs w:val="40"/>
         </w:rPr>
+        <w:lastRenderedPageBreak/>
         <w:t>In vite.config.js:</w:t>
       </w:r>
     </w:p>
@@ -589,7 +665,6 @@
           <w:sz w:val="40"/>
           <w:szCs w:val="40"/>
         </w:rPr>
-        <w:lastRenderedPageBreak/>
         <w:t>npm i react-router-dom@6</w:t>
       </w:r>
     </w:p>
@@ -816,6 +891,7 @@
           <w:sz w:val="40"/>
           <w:szCs w:val="40"/>
         </w:rPr>
+        <w:lastRenderedPageBreak/>
         <w:t>Redux DevTool: download extension and: npm i redux-devtools-extension</w:t>
       </w:r>
     </w:p>
@@ -911,7 +987,6 @@
           <w:sz w:val="40"/>
           <w:szCs w:val="40"/>
         </w:rPr>
-        <w:lastRenderedPageBreak/>
         <w:t xml:space="preserve">+Tailwind Prettier Extension: </w:t>
       </w:r>
       <w:hyperlink r:id="rId13" w:history="1">
@@ -1586,6 +1661,7 @@
   <w:style w:type="character" w:default="1" w:styleId="DefaultParagraphFont">
     <w:name w:val="Default Paragraph Font"/>
     <w:uiPriority w:val="1"/>
+    <w:semiHidden/>
     <w:unhideWhenUsed/>
   </w:style>
   <w:style w:type="table" w:default="1" w:styleId="TableNormal">

</xml_diff>

<commit_message>
Ultimate React Course: complete chap 24
</commit_message>
<xml_diff>
--- a/3.React/UltimateReactCourse/Document/0.docx
+++ b/3.React/UltimateReactCourse/Document/0.docx
@@ -14,7 +14,23 @@
           <w:sz w:val="40"/>
           <w:szCs w:val="40"/>
         </w:rPr>
-        <w:t xml:space="preserve">-Github: </w:t>
+        <w:t>-</w:t>
+      </w:r>
+      <w:proofErr w:type="spellStart"/>
+      <w:r>
+        <w:rPr>
+          <w:sz w:val="40"/>
+          <w:szCs w:val="40"/>
+        </w:rPr>
+        <w:t>Github</w:t>
+      </w:r>
+      <w:proofErr w:type="spellEnd"/>
+      <w:r>
+        <w:rPr>
+          <w:sz w:val="40"/>
+          <w:szCs w:val="40"/>
+        </w:rPr>
+        <w:t xml:space="preserve">: </w:t>
       </w:r>
       <w:hyperlink r:id="rId4" w:history="1">
         <w:r>
@@ -186,52 +202,116 @@
           <w:sz w:val="40"/>
           <w:szCs w:val="40"/>
         </w:rPr>
-        <w:t>+ESLint: automatically find errors</w:t>
-      </w:r>
-    </w:p>
-    <w:p>
-      <w:pPr>
-        <w:rPr>
-          <w:sz w:val="40"/>
-          <w:szCs w:val="40"/>
-        </w:rPr>
-      </w:pPr>
-      <w:r>
-        <w:rPr>
-          <w:sz w:val="40"/>
-          <w:szCs w:val="40"/>
-        </w:rPr>
-        <w:t>+Prettier-Code formatter: automatically format code</w:t>
-      </w:r>
-    </w:p>
-    <w:p>
-      <w:pPr>
-        <w:rPr>
-          <w:sz w:val="40"/>
-          <w:szCs w:val="40"/>
-        </w:rPr>
-      </w:pPr>
-      <w:r>
-        <w:rPr>
-          <w:sz w:val="40"/>
-          <w:szCs w:val="40"/>
-        </w:rPr>
-        <w:t>+One Monokai Theme: Set color theme</w:t>
-      </w:r>
-    </w:p>
-    <w:p>
-      <w:pPr>
-        <w:rPr>
-          <w:sz w:val="40"/>
-          <w:szCs w:val="40"/>
-        </w:rPr>
-      </w:pPr>
-      <w:r>
-        <w:rPr>
-          <w:sz w:val="40"/>
-          <w:szCs w:val="40"/>
-        </w:rPr>
-        <w:t>+Material Icon Theme:  theme for file icons</w:t>
+        <w:t>+</w:t>
+      </w:r>
+      <w:proofErr w:type="spellStart"/>
+      <w:r>
+        <w:rPr>
+          <w:sz w:val="40"/>
+          <w:szCs w:val="40"/>
+        </w:rPr>
+        <w:t>ESLint</w:t>
+      </w:r>
+      <w:proofErr w:type="spellEnd"/>
+      <w:r>
+        <w:rPr>
+          <w:sz w:val="40"/>
+          <w:szCs w:val="40"/>
+        </w:rPr>
+        <w:t>: automatically find errors</w:t>
+      </w:r>
+    </w:p>
+    <w:p>
+      <w:pPr>
+        <w:rPr>
+          <w:sz w:val="40"/>
+          <w:szCs w:val="40"/>
+        </w:rPr>
+      </w:pPr>
+      <w:r>
+        <w:rPr>
+          <w:sz w:val="40"/>
+          <w:szCs w:val="40"/>
+        </w:rPr>
+        <w:t xml:space="preserve">+Prettier-Code </w:t>
+      </w:r>
+      <w:proofErr w:type="gramStart"/>
+      <w:r>
+        <w:rPr>
+          <w:sz w:val="40"/>
+          <w:szCs w:val="40"/>
+        </w:rPr>
+        <w:t>formatter</w:t>
+      </w:r>
+      <w:proofErr w:type="gramEnd"/>
+      <w:r>
+        <w:rPr>
+          <w:sz w:val="40"/>
+          <w:szCs w:val="40"/>
+        </w:rPr>
+        <w:t>: automatically format code</w:t>
+      </w:r>
+    </w:p>
+    <w:p>
+      <w:pPr>
+        <w:rPr>
+          <w:sz w:val="40"/>
+          <w:szCs w:val="40"/>
+        </w:rPr>
+      </w:pPr>
+      <w:r>
+        <w:rPr>
+          <w:sz w:val="40"/>
+          <w:szCs w:val="40"/>
+        </w:rPr>
+        <w:t xml:space="preserve">+One </w:t>
+      </w:r>
+      <w:proofErr w:type="spellStart"/>
+      <w:r>
+        <w:rPr>
+          <w:sz w:val="40"/>
+          <w:szCs w:val="40"/>
+        </w:rPr>
+        <w:t>Monokai</w:t>
+      </w:r>
+      <w:proofErr w:type="spellEnd"/>
+      <w:r>
+        <w:rPr>
+          <w:sz w:val="40"/>
+          <w:szCs w:val="40"/>
+        </w:rPr>
+        <w:t xml:space="preserve"> Theme: Set color theme</w:t>
+      </w:r>
+    </w:p>
+    <w:p>
+      <w:pPr>
+        <w:rPr>
+          <w:sz w:val="40"/>
+          <w:szCs w:val="40"/>
+        </w:rPr>
+      </w:pPr>
+      <w:r>
+        <w:rPr>
+          <w:sz w:val="40"/>
+          <w:szCs w:val="40"/>
+        </w:rPr>
+        <w:t>+Material Icon Theme</w:t>
+      </w:r>
+      <w:proofErr w:type="gramStart"/>
+      <w:r>
+        <w:rPr>
+          <w:sz w:val="40"/>
+          <w:szCs w:val="40"/>
+        </w:rPr>
+        <w:t>:  theme</w:t>
+      </w:r>
+      <w:proofErr w:type="gramEnd"/>
+      <w:r>
+        <w:rPr>
+          <w:sz w:val="40"/>
+          <w:szCs w:val="40"/>
+        </w:rPr>
+        <w:t xml:space="preserve"> for file icons</w:t>
       </w:r>
     </w:p>
     <w:p>
@@ -277,8 +357,17 @@
           <w:sz w:val="40"/>
           <w:szCs w:val="40"/>
         </w:rPr>
-        <w:t>Files: auto save: onFocusChange</w:t>
-      </w:r>
+        <w:t xml:space="preserve">Files: auto save: </w:t>
+      </w:r>
+      <w:proofErr w:type="spellStart"/>
+      <w:r>
+        <w:rPr>
+          <w:sz w:val="40"/>
+          <w:szCs w:val="40"/>
+        </w:rPr>
+        <w:t>onFocusChange</w:t>
+      </w:r>
+      <w:proofErr w:type="spellEnd"/>
     </w:p>
     <w:p>
       <w:pPr>
@@ -317,42 +406,93 @@
           <w:szCs w:val="40"/>
         </w:rPr>
       </w:pPr>
-      <w:r>
-        <w:rPr>
-          <w:sz w:val="40"/>
-          <w:szCs w:val="40"/>
-        </w:rPr>
-        <w:t>Eslint Run: onSave</w:t>
-      </w:r>
-    </w:p>
-    <w:p>
-      <w:pPr>
-        <w:rPr>
-          <w:sz w:val="40"/>
-          <w:szCs w:val="40"/>
-        </w:rPr>
-      </w:pPr>
-      <w:r>
-        <w:rPr>
-          <w:sz w:val="40"/>
-          <w:szCs w:val="40"/>
-        </w:rPr>
-        <w:t>-Set up project with Create-React-App:</w:t>
-      </w:r>
-    </w:p>
-    <w:p>
-      <w:pPr>
-        <w:rPr>
-          <w:sz w:val="40"/>
-          <w:szCs w:val="40"/>
-        </w:rPr>
-      </w:pPr>
-      <w:r>
-        <w:rPr>
-          <w:sz w:val="40"/>
-          <w:szCs w:val="40"/>
-        </w:rPr>
-        <w:t>npx create-react-app@</w:t>
+      <w:proofErr w:type="spellStart"/>
+      <w:r>
+        <w:rPr>
+          <w:sz w:val="40"/>
+          <w:szCs w:val="40"/>
+        </w:rPr>
+        <w:t>Eslint</w:t>
+      </w:r>
+      <w:proofErr w:type="spellEnd"/>
+      <w:r>
+        <w:rPr>
+          <w:sz w:val="40"/>
+          <w:szCs w:val="40"/>
+        </w:rPr>
+        <w:t xml:space="preserve"> Run: </w:t>
+      </w:r>
+      <w:proofErr w:type="spellStart"/>
+      <w:r>
+        <w:rPr>
+          <w:sz w:val="40"/>
+          <w:szCs w:val="40"/>
+        </w:rPr>
+        <w:t>onSave</w:t>
+      </w:r>
+      <w:proofErr w:type="spellEnd"/>
+    </w:p>
+    <w:p>
+      <w:pPr>
+        <w:rPr>
+          <w:sz w:val="40"/>
+          <w:szCs w:val="40"/>
+        </w:rPr>
+      </w:pPr>
+      <w:r>
+        <w:rPr>
+          <w:sz w:val="40"/>
+          <w:szCs w:val="40"/>
+        </w:rPr>
+        <w:t xml:space="preserve">-Set up </w:t>
+      </w:r>
+      <w:proofErr w:type="gramStart"/>
+      <w:r>
+        <w:rPr>
+          <w:sz w:val="40"/>
+          <w:szCs w:val="40"/>
+        </w:rPr>
+        <w:t>project</w:t>
+      </w:r>
+      <w:proofErr w:type="gramEnd"/>
+      <w:r>
+        <w:rPr>
+          <w:sz w:val="40"/>
+          <w:szCs w:val="40"/>
+        </w:rPr>
+        <w:t xml:space="preserve"> with Create-React-App:</w:t>
+      </w:r>
+    </w:p>
+    <w:p>
+      <w:pPr>
+        <w:rPr>
+          <w:sz w:val="40"/>
+          <w:szCs w:val="40"/>
+        </w:rPr>
+      </w:pPr>
+      <w:proofErr w:type="spellStart"/>
+      <w:r>
+        <w:rPr>
+          <w:sz w:val="40"/>
+          <w:szCs w:val="40"/>
+        </w:rPr>
+        <w:t>npx</w:t>
+      </w:r>
+      <w:proofErr w:type="spellEnd"/>
+      <w:r>
+        <w:rPr>
+          <w:sz w:val="40"/>
+          <w:szCs w:val="40"/>
+        </w:rPr>
+        <w:t xml:space="preserve"> </w:t>
+      </w:r>
+      <w:proofErr w:type="spellStart"/>
+      <w:r>
+        <w:rPr>
+          <w:sz w:val="40"/>
+          <w:szCs w:val="40"/>
+        </w:rPr>
+        <w:t>create-react-app@</w:t>
       </w:r>
       <w:r>
         <w:rPr>
@@ -363,6 +503,7 @@
         </w:rPr>
         <w:t>version</w:t>
       </w:r>
+      <w:proofErr w:type="spellEnd"/>
       <w:r>
         <w:rPr>
           <w:sz w:val="40"/>
@@ -387,12 +528,21 @@
           <w:szCs w:val="40"/>
         </w:rPr>
       </w:pPr>
-      <w:r>
-        <w:rPr>
-          <w:sz w:val="40"/>
-          <w:szCs w:val="40"/>
-        </w:rPr>
-        <w:t>npm start</w:t>
+      <w:proofErr w:type="spellStart"/>
+      <w:r>
+        <w:rPr>
+          <w:sz w:val="40"/>
+          <w:szCs w:val="40"/>
+        </w:rPr>
+        <w:t>npm</w:t>
+      </w:r>
+      <w:proofErr w:type="spellEnd"/>
+      <w:r>
+        <w:rPr>
+          <w:sz w:val="40"/>
+          <w:szCs w:val="40"/>
+        </w:rPr>
+        <w:t xml:space="preserve"> start</w:t>
       </w:r>
     </w:p>
     <w:p>
@@ -417,42 +567,85 @@
           <w:szCs w:val="40"/>
         </w:rPr>
       </w:pPr>
-      <w:r>
-        <w:rPr>
-          <w:sz w:val="40"/>
-          <w:szCs w:val="40"/>
-        </w:rPr>
-        <w:t xml:space="preserve">npm create vite@latest &lt;folder-name&gt; -- --template react </w:t>
-      </w:r>
-    </w:p>
-    <w:p>
-      <w:pPr>
-        <w:rPr>
-          <w:sz w:val="40"/>
-          <w:szCs w:val="40"/>
-        </w:rPr>
-      </w:pPr>
-      <w:r>
-        <w:rPr>
-          <w:sz w:val="40"/>
-          <w:szCs w:val="40"/>
-        </w:rPr>
-        <w:t>npm install</w:t>
-      </w:r>
-    </w:p>
-    <w:p>
-      <w:pPr>
-        <w:rPr>
-          <w:sz w:val="40"/>
-          <w:szCs w:val="40"/>
-        </w:rPr>
-      </w:pPr>
-      <w:r>
-        <w:rPr>
-          <w:sz w:val="40"/>
-          <w:szCs w:val="40"/>
-        </w:rPr>
-        <w:t>npm run dev</w:t>
+      <w:proofErr w:type="spellStart"/>
+      <w:r>
+        <w:rPr>
+          <w:sz w:val="40"/>
+          <w:szCs w:val="40"/>
+        </w:rPr>
+        <w:t>npm</w:t>
+      </w:r>
+      <w:proofErr w:type="spellEnd"/>
+      <w:r>
+        <w:rPr>
+          <w:sz w:val="40"/>
+          <w:szCs w:val="40"/>
+        </w:rPr>
+        <w:t xml:space="preserve"> create </w:t>
+      </w:r>
+      <w:proofErr w:type="spellStart"/>
+      <w:r>
+        <w:rPr>
+          <w:sz w:val="40"/>
+          <w:szCs w:val="40"/>
+        </w:rPr>
+        <w:t>vite@latest</w:t>
+      </w:r>
+      <w:proofErr w:type="spellEnd"/>
+      <w:r>
+        <w:rPr>
+          <w:sz w:val="40"/>
+          <w:szCs w:val="40"/>
+        </w:rPr>
+        <w:t xml:space="preserve"> &lt;folder-name&gt; -- --template react </w:t>
+      </w:r>
+    </w:p>
+    <w:p>
+      <w:pPr>
+        <w:rPr>
+          <w:sz w:val="40"/>
+          <w:szCs w:val="40"/>
+        </w:rPr>
+      </w:pPr>
+      <w:proofErr w:type="spellStart"/>
+      <w:r>
+        <w:rPr>
+          <w:sz w:val="40"/>
+          <w:szCs w:val="40"/>
+        </w:rPr>
+        <w:t>npm</w:t>
+      </w:r>
+      <w:proofErr w:type="spellEnd"/>
+      <w:r>
+        <w:rPr>
+          <w:sz w:val="40"/>
+          <w:szCs w:val="40"/>
+        </w:rPr>
+        <w:t xml:space="preserve"> install</w:t>
+      </w:r>
+    </w:p>
+    <w:p>
+      <w:pPr>
+        <w:rPr>
+          <w:sz w:val="40"/>
+          <w:szCs w:val="40"/>
+        </w:rPr>
+      </w:pPr>
+      <w:proofErr w:type="spellStart"/>
+      <w:r>
+        <w:rPr>
+          <w:sz w:val="40"/>
+          <w:szCs w:val="40"/>
+        </w:rPr>
+        <w:t>npm</w:t>
+      </w:r>
+      <w:proofErr w:type="spellEnd"/>
+      <w:r>
+        <w:rPr>
+          <w:sz w:val="40"/>
+          <w:szCs w:val="40"/>
+        </w:rPr>
+        <w:t xml:space="preserve"> run dev</w:t>
       </w:r>
     </w:p>
     <w:p>
@@ -482,23 +675,57 @@
           <w:sz w:val="40"/>
           <w:szCs w:val="40"/>
         </w:rPr>
-        <w:t xml:space="preserve">+ESlint: </w:t>
-      </w:r>
-    </w:p>
-    <w:p>
-      <w:pPr>
-        <w:rPr>
-          <w:sz w:val="40"/>
-          <w:szCs w:val="40"/>
-        </w:rPr>
-      </w:pPr>
-      <w:r>
-        <w:rPr>
-          <w:sz w:val="40"/>
-          <w:szCs w:val="40"/>
-        </w:rPr>
-        <w:t>Create .eslintrc.json</w:t>
-      </w:r>
+        <w:t>+</w:t>
+      </w:r>
+      <w:proofErr w:type="spellStart"/>
+      <w:r>
+        <w:rPr>
+          <w:sz w:val="40"/>
+          <w:szCs w:val="40"/>
+        </w:rPr>
+        <w:t>ESlint</w:t>
+      </w:r>
+      <w:proofErr w:type="spellEnd"/>
+      <w:r>
+        <w:rPr>
+          <w:sz w:val="40"/>
+          <w:szCs w:val="40"/>
+        </w:rPr>
+        <w:t xml:space="preserve">: </w:t>
+      </w:r>
+    </w:p>
+    <w:p>
+      <w:pPr>
+        <w:rPr>
+          <w:sz w:val="40"/>
+          <w:szCs w:val="40"/>
+        </w:rPr>
+      </w:pPr>
+      <w:proofErr w:type="gramStart"/>
+      <w:r>
+        <w:rPr>
+          <w:sz w:val="40"/>
+          <w:szCs w:val="40"/>
+        </w:rPr>
+        <w:t>Create .</w:t>
+      </w:r>
+      <w:proofErr w:type="spellStart"/>
+      <w:r>
+        <w:rPr>
+          <w:sz w:val="40"/>
+          <w:szCs w:val="40"/>
+        </w:rPr>
+        <w:t>eslintrc</w:t>
+      </w:r>
+      <w:proofErr w:type="gramEnd"/>
+      <w:r>
+        <w:rPr>
+          <w:sz w:val="40"/>
+          <w:szCs w:val="40"/>
+        </w:rPr>
+        <w:t>.json</w:t>
+      </w:r>
+      <w:proofErr w:type="spellEnd"/>
     </w:p>
     <w:p>
       <w:pPr>
@@ -619,12 +846,69 @@
           <w:szCs w:val="40"/>
         </w:rPr>
       </w:pPr>
-      <w:r>
-        <w:rPr>
-          <w:sz w:val="40"/>
-          <w:szCs w:val="40"/>
-        </w:rPr>
-        <w:t>npm install eslint@8 vite-plugin-eslint eslint-config-react-app --save-dev</w:t>
+      <w:proofErr w:type="spellStart"/>
+      <w:r>
+        <w:rPr>
+          <w:sz w:val="40"/>
+          <w:szCs w:val="40"/>
+        </w:rPr>
+        <w:t>npm</w:t>
+      </w:r>
+      <w:proofErr w:type="spellEnd"/>
+      <w:r>
+        <w:rPr>
+          <w:sz w:val="40"/>
+          <w:szCs w:val="40"/>
+        </w:rPr>
+        <w:t xml:space="preserve"> install eslint@8 </w:t>
+      </w:r>
+      <w:proofErr w:type="spellStart"/>
+      <w:r>
+        <w:rPr>
+          <w:sz w:val="40"/>
+          <w:szCs w:val="40"/>
+        </w:rPr>
+        <w:t>vite</w:t>
+      </w:r>
+      <w:proofErr w:type="spellEnd"/>
+      <w:r>
+        <w:rPr>
+          <w:sz w:val="40"/>
+          <w:szCs w:val="40"/>
+        </w:rPr>
+        <w:t>-plugin-</w:t>
+      </w:r>
+      <w:proofErr w:type="spellStart"/>
+      <w:r>
+        <w:rPr>
+          <w:sz w:val="40"/>
+          <w:szCs w:val="40"/>
+        </w:rPr>
+        <w:t>eslint</w:t>
+      </w:r>
+      <w:proofErr w:type="spellEnd"/>
+      <w:r>
+        <w:rPr>
+          <w:sz w:val="40"/>
+          <w:szCs w:val="40"/>
+        </w:rPr>
+        <w:t xml:space="preserve"> </w:t>
+      </w:r>
+      <w:proofErr w:type="spellStart"/>
+      <w:r>
+        <w:rPr>
+          <w:sz w:val="40"/>
+          <w:szCs w:val="40"/>
+        </w:rPr>
+        <w:t>eslint</w:t>
+      </w:r>
+      <w:proofErr w:type="spellEnd"/>
+      <w:r>
+        <w:rPr>
+          <w:sz w:val="40"/>
+          <w:szCs w:val="40"/>
+        </w:rPr>
+        <w:t>-config-react-app --save-dev</w:t>
       </w:r>
     </w:p>
     <w:p>
@@ -660,12 +944,37 @@
           <w:szCs w:val="40"/>
         </w:rPr>
       </w:pPr>
-      <w:r>
-        <w:rPr>
-          <w:sz w:val="40"/>
-          <w:szCs w:val="40"/>
-        </w:rPr>
-        <w:t>npm i react-router-dom@6</w:t>
+      <w:proofErr w:type="spellStart"/>
+      <w:r>
+        <w:rPr>
+          <w:sz w:val="40"/>
+          <w:szCs w:val="40"/>
+        </w:rPr>
+        <w:t>npm</w:t>
+      </w:r>
+      <w:proofErr w:type="spellEnd"/>
+      <w:r>
+        <w:rPr>
+          <w:sz w:val="40"/>
+          <w:szCs w:val="40"/>
+        </w:rPr>
+        <w:t xml:space="preserve"> </w:t>
+      </w:r>
+      <w:proofErr w:type="spellStart"/>
+      <w:r>
+        <w:rPr>
+          <w:sz w:val="40"/>
+          <w:szCs w:val="40"/>
+        </w:rPr>
+        <w:t>i</w:t>
+      </w:r>
+      <w:proofErr w:type="spellEnd"/>
+      <w:r>
+        <w:rPr>
+          <w:sz w:val="40"/>
+          <w:szCs w:val="40"/>
+        </w:rPr>
+        <w:t xml:space="preserve"> react-router-dom@6</w:t>
       </w:r>
     </w:p>
     <w:p>
@@ -720,8 +1029,17 @@
           <w:sz w:val="40"/>
           <w:szCs w:val="40"/>
         </w:rPr>
-        <w:t>leafletjs.com/examples/quick-start</w:t>
-      </w:r>
+        <w:t>leafletjs.com/examples/</w:t>
+      </w:r>
+      <w:proofErr w:type="gramStart"/>
+      <w:r>
+        <w:rPr>
+          <w:sz w:val="40"/>
+          <w:szCs w:val="40"/>
+        </w:rPr>
+        <w:t>quick-start</w:t>
+      </w:r>
+      <w:proofErr w:type="gramEnd"/>
     </w:p>
     <w:p>
       <w:pPr>
@@ -745,13 +1063,23 @@
           <w:szCs w:val="40"/>
         </w:rPr>
       </w:pPr>
-      <w:r>
-        <w:rPr>
-          <w:sz w:val="40"/>
-          <w:szCs w:val="40"/>
-        </w:rPr>
-        <w:t xml:space="preserve">npm </w:t>
-      </w:r>
+      <w:proofErr w:type="spellStart"/>
+      <w:r>
+        <w:rPr>
+          <w:sz w:val="40"/>
+          <w:szCs w:val="40"/>
+        </w:rPr>
+        <w:t>npm</w:t>
+      </w:r>
+      <w:proofErr w:type="spellEnd"/>
+      <w:r>
+        <w:rPr>
+          <w:sz w:val="40"/>
+          <w:szCs w:val="40"/>
+        </w:rPr>
+        <w:t xml:space="preserve"> </w:t>
+      </w:r>
+      <w:proofErr w:type="spellStart"/>
       <w:r>
         <w:rPr>
           <w:sz w:val="40"/>
@@ -759,6 +1087,7 @@
         </w:rPr>
         <w:t>i</w:t>
       </w:r>
+      <w:proofErr w:type="spellEnd"/>
       <w:r>
         <w:rPr>
           <w:sz w:val="40"/>
@@ -781,6 +1110,7 @@
         </w:rPr>
         <w:t>+</w:t>
       </w:r>
+      <w:proofErr w:type="spellStart"/>
       <w:r>
         <w:rPr>
           <w:b/>
@@ -790,6 +1120,7 @@
         </w:rPr>
         <w:t>Datepicker</w:t>
       </w:r>
+      <w:proofErr w:type="spellEnd"/>
       <w:r>
         <w:rPr>
           <w:sz w:val="40"/>
@@ -819,13 +1150,47 @@
           <w:szCs w:val="40"/>
         </w:rPr>
       </w:pPr>
-      <w:r>
-        <w:rPr>
-          <w:sz w:val="40"/>
-          <w:szCs w:val="40"/>
-        </w:rPr>
-        <w:t>npm i react-datepicker</w:t>
-      </w:r>
+      <w:proofErr w:type="spellStart"/>
+      <w:r>
+        <w:rPr>
+          <w:sz w:val="40"/>
+          <w:szCs w:val="40"/>
+        </w:rPr>
+        <w:t>npm</w:t>
+      </w:r>
+      <w:proofErr w:type="spellEnd"/>
+      <w:r>
+        <w:rPr>
+          <w:sz w:val="40"/>
+          <w:szCs w:val="40"/>
+        </w:rPr>
+        <w:t xml:space="preserve"> </w:t>
+      </w:r>
+      <w:proofErr w:type="spellStart"/>
+      <w:r>
+        <w:rPr>
+          <w:sz w:val="40"/>
+          <w:szCs w:val="40"/>
+        </w:rPr>
+        <w:t>i</w:t>
+      </w:r>
+      <w:proofErr w:type="spellEnd"/>
+      <w:r>
+        <w:rPr>
+          <w:sz w:val="40"/>
+          <w:szCs w:val="40"/>
+        </w:rPr>
+        <w:t xml:space="preserve"> react-</w:t>
+      </w:r>
+      <w:proofErr w:type="spellStart"/>
+      <w:r>
+        <w:rPr>
+          <w:sz w:val="40"/>
+          <w:szCs w:val="40"/>
+        </w:rPr>
+        <w:t>datepicker</w:t>
+      </w:r>
+      <w:proofErr w:type="spellEnd"/>
     </w:p>
     <w:p>
       <w:pPr>
@@ -846,38 +1211,129 @@
           <w:sz w:val="40"/>
           <w:szCs w:val="40"/>
         </w:rPr>
-        <w:t>: npm i redux</w:t>
-      </w:r>
-    </w:p>
-    <w:p>
-      <w:pPr>
-        <w:rPr>
-          <w:sz w:val="40"/>
-          <w:szCs w:val="40"/>
-        </w:rPr>
-      </w:pPr>
-      <w:r>
-        <w:rPr>
-          <w:sz w:val="40"/>
-          <w:szCs w:val="40"/>
-        </w:rPr>
-        <w:t xml:space="preserve">npm i react-redux </w:t>
-      </w:r>
-    </w:p>
-    <w:p>
-      <w:pPr>
-        <w:rPr>
-          <w:sz w:val="40"/>
-          <w:szCs w:val="40"/>
-        </w:rPr>
-      </w:pPr>
-      <w:r>
-        <w:rPr>
-          <w:sz w:val="40"/>
-          <w:szCs w:val="40"/>
-        </w:rPr>
-        <w:t>npm i redux-thunk</w:t>
-      </w:r>
+        <w:t xml:space="preserve">: </w:t>
+      </w:r>
+      <w:proofErr w:type="spellStart"/>
+      <w:r>
+        <w:rPr>
+          <w:sz w:val="40"/>
+          <w:szCs w:val="40"/>
+        </w:rPr>
+        <w:t>npm</w:t>
+      </w:r>
+      <w:proofErr w:type="spellEnd"/>
+      <w:r>
+        <w:rPr>
+          <w:sz w:val="40"/>
+          <w:szCs w:val="40"/>
+        </w:rPr>
+        <w:t xml:space="preserve"> </w:t>
+      </w:r>
+      <w:proofErr w:type="spellStart"/>
+      <w:r>
+        <w:rPr>
+          <w:sz w:val="40"/>
+          <w:szCs w:val="40"/>
+        </w:rPr>
+        <w:t>i</w:t>
+      </w:r>
+      <w:proofErr w:type="spellEnd"/>
+      <w:r>
+        <w:rPr>
+          <w:sz w:val="40"/>
+          <w:szCs w:val="40"/>
+        </w:rPr>
+        <w:t xml:space="preserve"> redux</w:t>
+      </w:r>
+    </w:p>
+    <w:p>
+      <w:pPr>
+        <w:rPr>
+          <w:sz w:val="40"/>
+          <w:szCs w:val="40"/>
+        </w:rPr>
+      </w:pPr>
+      <w:proofErr w:type="spellStart"/>
+      <w:r>
+        <w:rPr>
+          <w:sz w:val="40"/>
+          <w:szCs w:val="40"/>
+        </w:rPr>
+        <w:t>npm</w:t>
+      </w:r>
+      <w:proofErr w:type="spellEnd"/>
+      <w:r>
+        <w:rPr>
+          <w:sz w:val="40"/>
+          <w:szCs w:val="40"/>
+        </w:rPr>
+        <w:t xml:space="preserve"> </w:t>
+      </w:r>
+      <w:proofErr w:type="spellStart"/>
+      <w:r>
+        <w:rPr>
+          <w:sz w:val="40"/>
+          <w:szCs w:val="40"/>
+        </w:rPr>
+        <w:t>i</w:t>
+      </w:r>
+      <w:proofErr w:type="spellEnd"/>
+      <w:r>
+        <w:rPr>
+          <w:sz w:val="40"/>
+          <w:szCs w:val="40"/>
+        </w:rPr>
+        <w:t xml:space="preserve"> react-redux </w:t>
+      </w:r>
+    </w:p>
+    <w:p>
+      <w:pPr>
+        <w:rPr>
+          <w:sz w:val="40"/>
+          <w:szCs w:val="40"/>
+        </w:rPr>
+      </w:pPr>
+      <w:proofErr w:type="spellStart"/>
+      <w:r>
+        <w:rPr>
+          <w:sz w:val="40"/>
+          <w:szCs w:val="40"/>
+        </w:rPr>
+        <w:t>npm</w:t>
+      </w:r>
+      <w:proofErr w:type="spellEnd"/>
+      <w:r>
+        <w:rPr>
+          <w:sz w:val="40"/>
+          <w:szCs w:val="40"/>
+        </w:rPr>
+        <w:t xml:space="preserve"> </w:t>
+      </w:r>
+      <w:proofErr w:type="spellStart"/>
+      <w:r>
+        <w:rPr>
+          <w:sz w:val="40"/>
+          <w:szCs w:val="40"/>
+        </w:rPr>
+        <w:t>i</w:t>
+      </w:r>
+      <w:proofErr w:type="spellEnd"/>
+      <w:r>
+        <w:rPr>
+          <w:sz w:val="40"/>
+          <w:szCs w:val="40"/>
+        </w:rPr>
+        <w:t xml:space="preserve"> redux-</w:t>
+      </w:r>
+      <w:proofErr w:type="spellStart"/>
+      <w:r>
+        <w:rPr>
+          <w:sz w:val="40"/>
+          <w:szCs w:val="40"/>
+        </w:rPr>
+        <w:t>thunk</w:t>
+      </w:r>
+      <w:proofErr w:type="spellEnd"/>
     </w:p>
     <w:p>
       <w:pPr>
@@ -892,22 +1348,127 @@
           <w:szCs w:val="40"/>
         </w:rPr>
         <w:lastRenderedPageBreak/>
-        <w:t>Redux DevTool: download extension and: npm i redux-devtools-extension</w:t>
-      </w:r>
-    </w:p>
-    <w:p>
-      <w:pPr>
-        <w:rPr>
-          <w:sz w:val="40"/>
-          <w:szCs w:val="40"/>
-        </w:rPr>
-      </w:pPr>
-      <w:r>
-        <w:rPr>
-          <w:sz w:val="40"/>
-          <w:szCs w:val="40"/>
-        </w:rPr>
-        <w:t>Redux Toolkit: npm i @reduxjs/toolkit</w:t>
+        <w:t xml:space="preserve">Redux </w:t>
+      </w:r>
+      <w:proofErr w:type="spellStart"/>
+      <w:r>
+        <w:rPr>
+          <w:sz w:val="40"/>
+          <w:szCs w:val="40"/>
+        </w:rPr>
+        <w:t>DevTool</w:t>
+      </w:r>
+      <w:proofErr w:type="spellEnd"/>
+      <w:r>
+        <w:rPr>
+          <w:sz w:val="40"/>
+          <w:szCs w:val="40"/>
+        </w:rPr>
+        <w:t xml:space="preserve">: download extension and: </w:t>
+      </w:r>
+      <w:proofErr w:type="spellStart"/>
+      <w:r>
+        <w:rPr>
+          <w:sz w:val="40"/>
+          <w:szCs w:val="40"/>
+        </w:rPr>
+        <w:t>npm</w:t>
+      </w:r>
+      <w:proofErr w:type="spellEnd"/>
+      <w:r>
+        <w:rPr>
+          <w:sz w:val="40"/>
+          <w:szCs w:val="40"/>
+        </w:rPr>
+        <w:t xml:space="preserve"> </w:t>
+      </w:r>
+      <w:proofErr w:type="spellStart"/>
+      <w:r>
+        <w:rPr>
+          <w:sz w:val="40"/>
+          <w:szCs w:val="40"/>
+        </w:rPr>
+        <w:t>i</w:t>
+      </w:r>
+      <w:proofErr w:type="spellEnd"/>
+      <w:r>
+        <w:rPr>
+          <w:sz w:val="40"/>
+          <w:szCs w:val="40"/>
+        </w:rPr>
+        <w:t xml:space="preserve"> redux-</w:t>
+      </w:r>
+      <w:proofErr w:type="spellStart"/>
+      <w:r>
+        <w:rPr>
+          <w:sz w:val="40"/>
+          <w:szCs w:val="40"/>
+        </w:rPr>
+        <w:t>devtools</w:t>
+      </w:r>
+      <w:proofErr w:type="spellEnd"/>
+      <w:r>
+        <w:rPr>
+          <w:sz w:val="40"/>
+          <w:szCs w:val="40"/>
+        </w:rPr>
+        <w:t>-extension</w:t>
+      </w:r>
+    </w:p>
+    <w:p>
+      <w:pPr>
+        <w:rPr>
+          <w:sz w:val="40"/>
+          <w:szCs w:val="40"/>
+        </w:rPr>
+      </w:pPr>
+      <w:r>
+        <w:rPr>
+          <w:sz w:val="40"/>
+          <w:szCs w:val="40"/>
+        </w:rPr>
+        <w:t xml:space="preserve">Redux Toolkit: </w:t>
+      </w:r>
+      <w:proofErr w:type="spellStart"/>
+      <w:r>
+        <w:rPr>
+          <w:sz w:val="40"/>
+          <w:szCs w:val="40"/>
+        </w:rPr>
+        <w:t>npm</w:t>
+      </w:r>
+      <w:proofErr w:type="spellEnd"/>
+      <w:r>
+        <w:rPr>
+          <w:sz w:val="40"/>
+          <w:szCs w:val="40"/>
+        </w:rPr>
+        <w:t xml:space="preserve"> </w:t>
+      </w:r>
+      <w:proofErr w:type="spellStart"/>
+      <w:proofErr w:type="gramStart"/>
+      <w:r>
+        <w:rPr>
+          <w:sz w:val="40"/>
+          <w:szCs w:val="40"/>
+        </w:rPr>
+        <w:t>i</w:t>
+      </w:r>
+      <w:proofErr w:type="spellEnd"/>
+      <w:r>
+        <w:rPr>
+          <w:sz w:val="40"/>
+          <w:szCs w:val="40"/>
+        </w:rPr>
+        <w:t xml:space="preserve"> @</w:t>
+      </w:r>
+      <w:proofErr w:type="gramEnd"/>
+      <w:r>
+        <w:rPr>
+          <w:sz w:val="40"/>
+          <w:szCs w:val="40"/>
+        </w:rPr>
+        <w:t>reduxjs/toolkit</w:t>
       </w:r>
     </w:p>
     <w:p>
@@ -967,13 +1528,24 @@
           <w:szCs w:val="40"/>
         </w:rPr>
       </w:pPr>
-      <w:r>
-        <w:rPr>
-          <w:sz w:val="40"/>
-          <w:szCs w:val="40"/>
-        </w:rPr>
-        <w:t>bradlc.vscode-tailwindcss</w:t>
-      </w:r>
+      <w:proofErr w:type="spellStart"/>
+      <w:proofErr w:type="gramStart"/>
+      <w:r>
+        <w:rPr>
+          <w:sz w:val="40"/>
+          <w:szCs w:val="40"/>
+        </w:rPr>
+        <w:t>bradlc.vscode</w:t>
+      </w:r>
+      <w:proofErr w:type="gramEnd"/>
+      <w:r>
+        <w:rPr>
+          <w:sz w:val="40"/>
+          <w:szCs w:val="40"/>
+        </w:rPr>
+        <w:t>-tailwindcss</w:t>
+      </w:r>
+      <w:proofErr w:type="spellEnd"/>
     </w:p>
     <w:p>
       <w:pPr>
@@ -1047,6 +1619,55 @@
           </wp:inline>
         </w:drawing>
       </w:r>
+    </w:p>
+    <w:p>
+      <w:pPr>
+        <w:rPr>
+          <w:sz w:val="40"/>
+          <w:szCs w:val="40"/>
+        </w:rPr>
+      </w:pPr>
+      <w:r>
+        <w:rPr>
+          <w:sz w:val="40"/>
+          <w:szCs w:val="40"/>
+        </w:rPr>
+        <w:t>-Styled Components</w:t>
+      </w:r>
+    </w:p>
+    <w:p>
+      <w:pPr>
+        <w:rPr>
+          <w:sz w:val="40"/>
+          <w:szCs w:val="40"/>
+        </w:rPr>
+      </w:pPr>
+      <w:proofErr w:type="spellStart"/>
+      <w:proofErr w:type="gramStart"/>
+      <w:r>
+        <w:rPr>
+          <w:sz w:val="40"/>
+          <w:szCs w:val="40"/>
+        </w:rPr>
+        <w:t>npm</w:t>
+      </w:r>
+      <w:proofErr w:type="spellEnd"/>
+      <w:proofErr w:type="gramEnd"/>
+      <w:r>
+        <w:rPr>
+          <w:sz w:val="40"/>
+          <w:szCs w:val="40"/>
+        </w:rPr>
+        <w:t xml:space="preserve"> I styled-components</w:t>
+      </w:r>
+    </w:p>
+    <w:p>
+      <w:pPr>
+        <w:rPr>
+          <w:sz w:val="40"/>
+          <w:szCs w:val="40"/>
+        </w:rPr>
+      </w:pPr>
     </w:p>
     <w:sectPr>
       <w:pgSz w:w="12240" w:h="15840"/>

</xml_diff>

<commit_message>
Ultimate React Course: complete section 25
</commit_message>
<xml_diff>
--- a/3.React/UltimateReactCourse/Document/0.docx
+++ b/3.React/UltimateReactCourse/Document/0.docx
@@ -342,6 +342,46 @@
           <w:szCs w:val="40"/>
         </w:rPr>
         <w:lastRenderedPageBreak/>
+        <w:t xml:space="preserve">+Styled components: </w:t>
+      </w:r>
+      <w:r>
+        <w:rPr>
+          <w:sz w:val="40"/>
+          <w:szCs w:val="40"/>
+        </w:rPr>
+        <w:t>styled-</w:t>
+      </w:r>
+      <w:proofErr w:type="spellStart"/>
+      <w:proofErr w:type="gramStart"/>
+      <w:r>
+        <w:rPr>
+          <w:sz w:val="40"/>
+          <w:szCs w:val="40"/>
+        </w:rPr>
+        <w:t>components.vscode</w:t>
+      </w:r>
+      <w:proofErr w:type="spellEnd"/>
+      <w:proofErr w:type="gramEnd"/>
+      <w:r>
+        <w:rPr>
+          <w:sz w:val="40"/>
+          <w:szCs w:val="40"/>
+        </w:rPr>
+        <w:t>-styled-components</w:t>
+      </w:r>
+    </w:p>
+    <w:p>
+      <w:pPr>
+        <w:rPr>
+          <w:sz w:val="40"/>
+          <w:szCs w:val="40"/>
+        </w:rPr>
+      </w:pPr>
+      <w:r>
+        <w:rPr>
+          <w:sz w:val="40"/>
+          <w:szCs w:val="40"/>
+        </w:rPr>
         <w:t>+In VS code Setting:</w:t>
       </w:r>
     </w:p>
@@ -738,6 +778,7 @@
         <w:rPr>
           <w:noProof/>
         </w:rPr>
+        <w:lastRenderedPageBreak/>
         <w:drawing>
           <wp:inline distT="0" distB="0" distL="0" distR="0" wp14:anchorId="7D6D79B5" wp14:editId="766A74EE">
             <wp:extent cx="1847850" cy="533400"/>
@@ -787,7 +828,6 @@
           <w:sz w:val="40"/>
           <w:szCs w:val="40"/>
         </w:rPr>
-        <w:lastRenderedPageBreak/>
         <w:t>In vite.config.js:</w:t>
       </w:r>
     </w:p>
@@ -925,7 +965,7 @@
           <w:sz w:val="40"/>
           <w:szCs w:val="40"/>
         </w:rPr>
-        <w:t>+</w:t>
+        <w:t>-</w:t>
       </w:r>
       <w:r>
         <w:rPr>
@@ -989,7 +1029,7 @@
           <w:sz w:val="40"/>
           <w:szCs w:val="40"/>
         </w:rPr>
-        <w:t>+</w:t>
+        <w:t>-</w:t>
       </w:r>
       <w:r>
         <w:rPr>
@@ -1108,7 +1148,7 @@
           <w:sz w:val="40"/>
           <w:szCs w:val="40"/>
         </w:rPr>
-        <w:t>+</w:t>
+        <w:t>-</w:t>
       </w:r>
       <w:proofErr w:type="spellStart"/>
       <w:r>
@@ -1227,6 +1267,54 @@
           <w:sz w:val="40"/>
           <w:szCs w:val="40"/>
         </w:rPr>
+        <w:t xml:space="preserve"> i redux</w:t>
+      </w:r>
+    </w:p>
+    <w:p>
+      <w:pPr>
+        <w:rPr>
+          <w:sz w:val="40"/>
+          <w:szCs w:val="40"/>
+        </w:rPr>
+      </w:pPr>
+      <w:proofErr w:type="spellStart"/>
+      <w:r>
+        <w:rPr>
+          <w:sz w:val="40"/>
+          <w:szCs w:val="40"/>
+        </w:rPr>
+        <w:t>npm</w:t>
+      </w:r>
+      <w:proofErr w:type="spellEnd"/>
+      <w:r>
+        <w:rPr>
+          <w:sz w:val="40"/>
+          <w:szCs w:val="40"/>
+        </w:rPr>
+        <w:t xml:space="preserve"> i react-redux </w:t>
+      </w:r>
+    </w:p>
+    <w:p>
+      <w:pPr>
+        <w:rPr>
+          <w:sz w:val="40"/>
+          <w:szCs w:val="40"/>
+        </w:rPr>
+      </w:pPr>
+      <w:proofErr w:type="spellStart"/>
+      <w:r>
+        <w:rPr>
+          <w:sz w:val="40"/>
+          <w:szCs w:val="40"/>
+        </w:rPr>
+        <w:t>npm</w:t>
+      </w:r>
+      <w:proofErr w:type="spellEnd"/>
+      <w:r>
+        <w:rPr>
+          <w:sz w:val="40"/>
+          <w:szCs w:val="40"/>
+        </w:rPr>
         <w:t xml:space="preserve"> </w:t>
       </w:r>
       <w:proofErr w:type="spellStart"/>
@@ -1243,86 +1331,6 @@
           <w:sz w:val="40"/>
           <w:szCs w:val="40"/>
         </w:rPr>
-        <w:t xml:space="preserve"> redux</w:t>
-      </w:r>
-    </w:p>
-    <w:p>
-      <w:pPr>
-        <w:rPr>
-          <w:sz w:val="40"/>
-          <w:szCs w:val="40"/>
-        </w:rPr>
-      </w:pPr>
-      <w:proofErr w:type="spellStart"/>
-      <w:r>
-        <w:rPr>
-          <w:sz w:val="40"/>
-          <w:szCs w:val="40"/>
-        </w:rPr>
-        <w:t>npm</w:t>
-      </w:r>
-      <w:proofErr w:type="spellEnd"/>
-      <w:r>
-        <w:rPr>
-          <w:sz w:val="40"/>
-          <w:szCs w:val="40"/>
-        </w:rPr>
-        <w:t xml:space="preserve"> </w:t>
-      </w:r>
-      <w:proofErr w:type="spellStart"/>
-      <w:r>
-        <w:rPr>
-          <w:sz w:val="40"/>
-          <w:szCs w:val="40"/>
-        </w:rPr>
-        <w:t>i</w:t>
-      </w:r>
-      <w:proofErr w:type="spellEnd"/>
-      <w:r>
-        <w:rPr>
-          <w:sz w:val="40"/>
-          <w:szCs w:val="40"/>
-        </w:rPr>
-        <w:t xml:space="preserve"> react-redux </w:t>
-      </w:r>
-    </w:p>
-    <w:p>
-      <w:pPr>
-        <w:rPr>
-          <w:sz w:val="40"/>
-          <w:szCs w:val="40"/>
-        </w:rPr>
-      </w:pPr>
-      <w:proofErr w:type="spellStart"/>
-      <w:r>
-        <w:rPr>
-          <w:sz w:val="40"/>
-          <w:szCs w:val="40"/>
-        </w:rPr>
-        <w:t>npm</w:t>
-      </w:r>
-      <w:proofErr w:type="spellEnd"/>
-      <w:r>
-        <w:rPr>
-          <w:sz w:val="40"/>
-          <w:szCs w:val="40"/>
-        </w:rPr>
-        <w:t xml:space="preserve"> </w:t>
-      </w:r>
-      <w:proofErr w:type="spellStart"/>
-      <w:r>
-        <w:rPr>
-          <w:sz w:val="40"/>
-          <w:szCs w:val="40"/>
-        </w:rPr>
-        <w:t>i</w:t>
-      </w:r>
-      <w:proofErr w:type="spellEnd"/>
-      <w:r>
-        <w:rPr>
-          <w:sz w:val="40"/>
-          <w:szCs w:val="40"/>
-        </w:rPr>
         <w:t xml:space="preserve"> redux-</w:t>
       </w:r>
       <w:proofErr w:type="spellStart"/>
@@ -1344,6 +1352,8 @@
       </w:pPr>
       <w:r>
         <w:rPr>
+          <w:b/>
+          <w:bCs/>
           <w:sz w:val="40"/>
           <w:szCs w:val="40"/>
         </w:rPr>
@@ -1353,6 +1363,8 @@
       <w:proofErr w:type="spellStart"/>
       <w:r>
         <w:rPr>
+          <w:b/>
+          <w:bCs/>
           <w:sz w:val="40"/>
           <w:szCs w:val="40"/>
         </w:rPr>
@@ -1424,10 +1436,19 @@
       </w:pPr>
       <w:r>
         <w:rPr>
-          <w:sz w:val="40"/>
-          <w:szCs w:val="40"/>
-        </w:rPr>
-        <w:t xml:space="preserve">Redux Toolkit: </w:t>
+          <w:b/>
+          <w:bCs/>
+          <w:sz w:val="40"/>
+          <w:szCs w:val="40"/>
+        </w:rPr>
+        <w:t>Redux Toolkit</w:t>
+      </w:r>
+      <w:r>
+        <w:rPr>
+          <w:sz w:val="40"/>
+          <w:szCs w:val="40"/>
+        </w:rPr>
+        <w:t xml:space="preserve">: </w:t>
       </w:r>
       <w:proofErr w:type="spellStart"/>
       <w:r>
@@ -1483,7 +1504,23 @@
           <w:sz w:val="40"/>
           <w:szCs w:val="40"/>
         </w:rPr>
-        <w:t xml:space="preserve">-Frank Furter: </w:t>
+        <w:t>-</w:t>
+      </w:r>
+      <w:r>
+        <w:rPr>
+          <w:b/>
+          <w:bCs/>
+          <w:sz w:val="40"/>
+          <w:szCs w:val="40"/>
+        </w:rPr>
+        <w:t>Frank Furter</w:t>
+      </w:r>
+      <w:r>
+        <w:rPr>
+          <w:sz w:val="40"/>
+          <w:szCs w:val="40"/>
+        </w:rPr>
+        <w:t xml:space="preserve">: </w:t>
       </w:r>
       <w:hyperlink r:id="rId11" w:history="1">
         <w:r>
@@ -1508,7 +1545,23 @@
           <w:sz w:val="40"/>
           <w:szCs w:val="40"/>
         </w:rPr>
-        <w:t xml:space="preserve">-Tailwind: </w:t>
+        <w:t>-</w:t>
+      </w:r>
+      <w:r>
+        <w:rPr>
+          <w:b/>
+          <w:bCs/>
+          <w:sz w:val="40"/>
+          <w:szCs w:val="40"/>
+        </w:rPr>
+        <w:t>Tailwind</w:t>
+      </w:r>
+      <w:r>
+        <w:rPr>
+          <w:sz w:val="40"/>
+          <w:szCs w:val="40"/>
+        </w:rPr>
+        <w:t xml:space="preserve">: </w:t>
       </w:r>
       <w:hyperlink r:id="rId12" w:history="1">
         <w:r>
@@ -1632,42 +1685,162 @@
           <w:sz w:val="40"/>
           <w:szCs w:val="40"/>
         </w:rPr>
-        <w:t>-Styled Components</w:t>
-      </w:r>
-    </w:p>
-    <w:p>
-      <w:pPr>
-        <w:rPr>
-          <w:sz w:val="40"/>
-          <w:szCs w:val="40"/>
-        </w:rPr>
-      </w:pPr>
-      <w:proofErr w:type="spellStart"/>
+        <w:t>-</w:t>
+      </w:r>
+      <w:r>
+        <w:rPr>
+          <w:b/>
+          <w:bCs/>
+          <w:sz w:val="40"/>
+          <w:szCs w:val="40"/>
+        </w:rPr>
+        <w:t>Styled Components</w:t>
+      </w:r>
+    </w:p>
+    <w:p>
+      <w:pPr>
+        <w:rPr>
+          <w:sz w:val="40"/>
+          <w:szCs w:val="40"/>
+        </w:rPr>
+      </w:pPr>
+      <w:proofErr w:type="spellStart"/>
+      <w:r>
+        <w:rPr>
+          <w:sz w:val="40"/>
+          <w:szCs w:val="40"/>
+        </w:rPr>
+        <w:t>npm</w:t>
+      </w:r>
+      <w:proofErr w:type="spellEnd"/>
+      <w:r>
+        <w:rPr>
+          <w:sz w:val="40"/>
+          <w:szCs w:val="40"/>
+        </w:rPr>
+        <w:t xml:space="preserve"> </w:t>
+      </w:r>
+      <w:proofErr w:type="spellStart"/>
+      <w:r>
+        <w:rPr>
+          <w:sz w:val="40"/>
+          <w:szCs w:val="40"/>
+        </w:rPr>
+        <w:t>i</w:t>
+      </w:r>
+      <w:proofErr w:type="spellEnd"/>
+      <w:r>
+        <w:rPr>
+          <w:sz w:val="40"/>
+          <w:szCs w:val="40"/>
+        </w:rPr>
+        <w:t xml:space="preserve"> </w:t>
+      </w:r>
       <w:proofErr w:type="gramStart"/>
       <w:r>
         <w:rPr>
           <w:sz w:val="40"/>
           <w:szCs w:val="40"/>
         </w:rPr>
+        <w:t>styled-components</w:t>
+      </w:r>
+      <w:proofErr w:type="gramEnd"/>
+    </w:p>
+    <w:p>
+      <w:pPr>
+        <w:rPr>
+          <w:sz w:val="40"/>
+          <w:szCs w:val="40"/>
+        </w:rPr>
+      </w:pPr>
+      <w:hyperlink r:id="rId15" w:history="1">
+        <w:r>
+          <w:rPr>
+            <w:rStyle w:val="Hyperlink"/>
+            <w:sz w:val="40"/>
+            <w:szCs w:val="40"/>
+          </w:rPr>
+          <w:t>https://styled-components.com/</w:t>
+        </w:r>
+      </w:hyperlink>
+    </w:p>
+    <w:p>
+      <w:pPr>
+        <w:rPr>
+          <w:sz w:val="40"/>
+          <w:szCs w:val="40"/>
+        </w:rPr>
+      </w:pPr>
+      <w:r>
+        <w:rPr>
+          <w:sz w:val="40"/>
+          <w:szCs w:val="40"/>
+        </w:rPr>
+        <w:t xml:space="preserve">-React Icons: </w:t>
+      </w:r>
+      <w:proofErr w:type="spellStart"/>
+      <w:r>
+        <w:rPr>
+          <w:sz w:val="40"/>
+          <w:szCs w:val="40"/>
+        </w:rPr>
         <w:t>npm</w:t>
       </w:r>
       <w:proofErr w:type="spellEnd"/>
+      <w:r>
+        <w:rPr>
+          <w:sz w:val="40"/>
+          <w:szCs w:val="40"/>
+        </w:rPr>
+        <w:t xml:space="preserve"> </w:t>
+      </w:r>
+      <w:proofErr w:type="spellStart"/>
+      <w:r>
+        <w:rPr>
+          <w:sz w:val="40"/>
+          <w:szCs w:val="40"/>
+        </w:rPr>
+        <w:t>i</w:t>
+      </w:r>
+      <w:proofErr w:type="spellEnd"/>
+      <w:r>
+        <w:rPr>
+          <w:sz w:val="40"/>
+          <w:szCs w:val="40"/>
+        </w:rPr>
+        <w:t xml:space="preserve"> </w:t>
+      </w:r>
+      <w:proofErr w:type="gramStart"/>
+      <w:r>
+        <w:rPr>
+          <w:sz w:val="40"/>
+          <w:szCs w:val="40"/>
+        </w:rPr>
+        <w:t>react</w:t>
+      </w:r>
       <w:proofErr w:type="gramEnd"/>
       <w:r>
         <w:rPr>
           <w:sz w:val="40"/>
           <w:szCs w:val="40"/>
         </w:rPr>
-        <w:t xml:space="preserve"> I styled-components</w:t>
-      </w:r>
-    </w:p>
-    <w:p>
-      <w:pPr>
-        <w:rPr>
-          <w:sz w:val="40"/>
-          <w:szCs w:val="40"/>
-        </w:rPr>
-      </w:pPr>
+        <w:t>-icons</w:t>
+      </w:r>
+    </w:p>
+    <w:p>
+      <w:pPr>
+        <w:rPr>
+          <w:sz w:val="40"/>
+          <w:szCs w:val="40"/>
+        </w:rPr>
+      </w:pPr>
+      <w:r>
+        <w:rPr>
+          <w:sz w:val="40"/>
+          <w:szCs w:val="40"/>
+        </w:rPr>
+        <w:t>https://react-icons.github.io/react-icons/</w:t>
+      </w:r>
     </w:p>
     <w:sectPr>
       <w:pgSz w:w="12240" w:h="15840"/>
@@ -2282,7 +2455,6 @@
   <w:style w:type="character" w:default="1" w:styleId="DefaultParagraphFont">
     <w:name w:val="Default Paragraph Font"/>
     <w:uiPriority w:val="1"/>
-    <w:semiHidden/>
     <w:unhideWhenUsed/>
   </w:style>
   <w:style w:type="table" w:default="1" w:styleId="TableNormal">

</xml_diff>

<commit_message>
Ultimate React Course: complete section 26
</commit_message>
<xml_diff>
--- a/3.React/UltimateReactCourse/Document/0.docx
+++ b/3.React/UltimateReactCourse/Document/0.docx
@@ -1776,7 +1776,23 @@
           <w:sz w:val="40"/>
           <w:szCs w:val="40"/>
         </w:rPr>
-        <w:t xml:space="preserve">-React Icons: </w:t>
+        <w:t>-</w:t>
+      </w:r>
+      <w:r>
+        <w:rPr>
+          <w:b/>
+          <w:bCs/>
+          <w:sz w:val="40"/>
+          <w:szCs w:val="40"/>
+        </w:rPr>
+        <w:t>React Icons</w:t>
+      </w:r>
+      <w:r>
+        <w:rPr>
+          <w:sz w:val="40"/>
+          <w:szCs w:val="40"/>
+        </w:rPr>
+        <w:t xml:space="preserve">: </w:t>
       </w:r>
       <w:proofErr w:type="spellStart"/>
       <w:r>
@@ -1834,12 +1850,109 @@
           <w:szCs w:val="40"/>
         </w:rPr>
       </w:pPr>
-      <w:r>
-        <w:rPr>
-          <w:sz w:val="40"/>
-          <w:szCs w:val="40"/>
-        </w:rPr>
-        <w:t>https://react-icons.github.io/react-icons/</w:t>
+      <w:hyperlink r:id="rId16" w:history="1">
+        <w:r>
+          <w:rPr>
+            <w:rStyle w:val="Hyperlink"/>
+            <w:sz w:val="40"/>
+            <w:szCs w:val="40"/>
+          </w:rPr>
+          <w:t>https://react-icons.github.io/react-icons/</w:t>
+        </w:r>
+      </w:hyperlink>
+    </w:p>
+    <w:p>
+      <w:pPr>
+        <w:rPr>
+          <w:sz w:val="40"/>
+          <w:szCs w:val="40"/>
+        </w:rPr>
+      </w:pPr>
+      <w:r>
+        <w:rPr>
+          <w:sz w:val="40"/>
+          <w:szCs w:val="40"/>
+        </w:rPr>
+        <w:t>-</w:t>
+      </w:r>
+      <w:proofErr w:type="spellStart"/>
+      <w:r>
+        <w:rPr>
+          <w:sz w:val="40"/>
+          <w:szCs w:val="40"/>
+        </w:rPr>
+        <w:t>Supabase</w:t>
+      </w:r>
+      <w:proofErr w:type="spellEnd"/>
+      <w:r>
+        <w:rPr>
+          <w:sz w:val="40"/>
+          <w:szCs w:val="40"/>
+        </w:rPr>
+        <w:t xml:space="preserve">: </w:t>
+      </w:r>
+    </w:p>
+    <w:p>
+      <w:pPr>
+        <w:rPr>
+          <w:sz w:val="40"/>
+          <w:szCs w:val="40"/>
+        </w:rPr>
+      </w:pPr>
+      <w:proofErr w:type="spellStart"/>
+      <w:proofErr w:type="gramStart"/>
+      <w:r>
+        <w:rPr>
+          <w:sz w:val="40"/>
+          <w:szCs w:val="40"/>
+        </w:rPr>
+        <w:t>npm</w:t>
+      </w:r>
+      <w:proofErr w:type="spellEnd"/>
+      <w:r>
+        <w:rPr>
+          <w:sz w:val="40"/>
+          <w:szCs w:val="40"/>
+        </w:rPr>
+        <w:t xml:space="preserve"> </w:t>
+      </w:r>
+      <w:proofErr w:type="spellStart"/>
+      <w:r>
+        <w:rPr>
+          <w:sz w:val="40"/>
+          <w:szCs w:val="40"/>
+        </w:rPr>
+        <w:t>i</w:t>
+      </w:r>
+      <w:proofErr w:type="spellEnd"/>
+      <w:r>
+        <w:rPr>
+          <w:sz w:val="40"/>
+          <w:szCs w:val="40"/>
+        </w:rPr>
+        <w:t xml:space="preserve"> </w:t>
+      </w:r>
+      <w:r>
+        <w:rPr>
+          <w:sz w:val="40"/>
+          <w:szCs w:val="40"/>
+        </w:rPr>
+        <w:t xml:space="preserve">--save </w:t>
+      </w:r>
+      <w:r>
+        <w:rPr>
+          <w:sz w:val="40"/>
+          <w:szCs w:val="40"/>
+        </w:rPr>
+        <w:t>@</w:t>
+      </w:r>
+      <w:proofErr w:type="gramEnd"/>
+      <w:r>
+        <w:rPr>
+          <w:sz w:val="40"/>
+          <w:szCs w:val="40"/>
+        </w:rPr>
+        <w:t>supabase/supabase-js</w:t>
       </w:r>
     </w:p>
     <w:sectPr>
@@ -2455,6 +2568,7 @@
   <w:style w:type="character" w:default="1" w:styleId="DefaultParagraphFont">
     <w:name w:val="Default Paragraph Font"/>
     <w:uiPriority w:val="1"/>
+    <w:semiHidden/>
     <w:unhideWhenUsed/>
   </w:style>
   <w:style w:type="table" w:default="1" w:styleId="TableNormal">

</xml_diff>

<commit_message>
Ultimate React Cource: complete section 27
</commit_message>
<xml_diff>
--- a/3.React/UltimateReactCourse/Document/0.docx
+++ b/3.React/UltimateReactCourse/Document/0.docx
@@ -320,7 +320,6 @@
         <w:t>styled-</w:t>
       </w:r>
       <w:proofErr w:type="spellStart"/>
-      <w:proofErr w:type="gramStart"/>
       <w:r>
         <w:rPr>
           <w:sz w:val="40"/>
@@ -329,7 +328,6 @@
         <w:t>components.vscode</w:t>
       </w:r>
       <w:proofErr w:type="spellEnd"/>
-      <w:proofErr w:type="gramEnd"/>
       <w:r>
         <w:rPr>
           <w:sz w:val="40"/>
@@ -693,7 +691,6 @@
           <w:szCs w:val="40"/>
         </w:rPr>
       </w:pPr>
-      <w:proofErr w:type="gramStart"/>
       <w:r>
         <w:rPr>
           <w:sz w:val="40"/>
@@ -707,15 +704,7 @@
           <w:sz w:val="40"/>
           <w:szCs w:val="40"/>
         </w:rPr>
-        <w:t>eslintrc</w:t>
-      </w:r>
-      <w:proofErr w:type="gramEnd"/>
-      <w:r>
-        <w:rPr>
-          <w:sz w:val="40"/>
-          <w:szCs w:val="40"/>
-        </w:rPr>
-        <w:t>.json</w:t>
+        <w:t>eslintrc.json</w:t>
       </w:r>
       <w:proofErr w:type="spellEnd"/>
     </w:p>
@@ -1516,21 +1505,12 @@
         </w:rPr>
       </w:pPr>
       <w:proofErr w:type="spellStart"/>
-      <w:proofErr w:type="gramStart"/>
-      <w:r>
-        <w:rPr>
-          <w:sz w:val="40"/>
-          <w:szCs w:val="40"/>
-        </w:rPr>
-        <w:t>bradlc.vscode</w:t>
-      </w:r>
-      <w:proofErr w:type="gramEnd"/>
-      <w:r>
-        <w:rPr>
-          <w:sz w:val="40"/>
-          <w:szCs w:val="40"/>
-        </w:rPr>
-        <w:t>-tailwindcss</w:t>
+      <w:r>
+        <w:rPr>
+          <w:sz w:val="40"/>
+          <w:szCs w:val="40"/>
+        </w:rPr>
+        <w:t>bradlc.vscode-tailwindcss</w:t>
       </w:r>
       <w:proofErr w:type="spellEnd"/>
     </w:p>
@@ -2028,7 +2008,6 @@
         </w:rPr>
       </w:pPr>
       <w:proofErr w:type="spellStart"/>
-      <w:proofErr w:type="gramStart"/>
       <w:r>
         <w:rPr>
           <w:sz w:val="40"/>
@@ -2058,15 +2037,7 @@
           <w:sz w:val="40"/>
           <w:szCs w:val="40"/>
         </w:rPr>
-        <w:t xml:space="preserve"> date</w:t>
-      </w:r>
-      <w:proofErr w:type="gramEnd"/>
-      <w:r>
-        <w:rPr>
-          <w:sz w:val="40"/>
-          <w:szCs w:val="40"/>
-        </w:rPr>
-        <w:t>-</w:t>
+        <w:t xml:space="preserve"> date-</w:t>
       </w:r>
       <w:proofErr w:type="spellStart"/>
       <w:r>
@@ -2150,6 +2121,60 @@
           <w:szCs w:val="40"/>
         </w:rPr>
       </w:pPr>
+      <w:r>
+        <w:rPr>
+          <w:sz w:val="40"/>
+          <w:szCs w:val="40"/>
+        </w:rPr>
+        <w:t xml:space="preserve">-React hook form: </w:t>
+      </w:r>
+      <w:r>
+        <w:rPr>
+          <w:sz w:val="40"/>
+          <w:szCs w:val="40"/>
+        </w:rPr>
+        <w:t>https://react-hook-form.com/</w:t>
+      </w:r>
+    </w:p>
+    <w:p>
+      <w:pPr>
+        <w:rPr>
+          <w:sz w:val="40"/>
+          <w:szCs w:val="40"/>
+        </w:rPr>
+      </w:pPr>
+      <w:proofErr w:type="spellStart"/>
+      <w:r>
+        <w:rPr>
+          <w:sz w:val="40"/>
+          <w:szCs w:val="40"/>
+        </w:rPr>
+        <w:t>npm</w:t>
+      </w:r>
+      <w:proofErr w:type="spellEnd"/>
+      <w:r>
+        <w:rPr>
+          <w:sz w:val="40"/>
+          <w:szCs w:val="40"/>
+        </w:rPr>
+        <w:t xml:space="preserve"> </w:t>
+      </w:r>
+      <w:proofErr w:type="spellStart"/>
+      <w:r>
+        <w:rPr>
+          <w:sz w:val="40"/>
+          <w:szCs w:val="40"/>
+        </w:rPr>
+        <w:t>i</w:t>
+      </w:r>
+      <w:proofErr w:type="spellEnd"/>
+      <w:r>
+        <w:rPr>
+          <w:sz w:val="40"/>
+          <w:szCs w:val="40"/>
+        </w:rPr>
+        <w:t xml:space="preserve"> react-hook-form@7</w:t>
+      </w:r>
     </w:p>
     <w:sectPr>
       <w:pgSz w:w="12240" w:h="15840"/>

</xml_diff>